<commit_message>
revision ajout des trucs manquant
</commit_message>
<xml_diff>
--- a/annexe11/Annexe11-_Exceptions_controlees.docx
+++ b/annexe11/Annexe11-_Exceptions_controlees.docx
@@ -1,6 +1,6 @@
 
 <file path=word/document.xml><?xml version="1.0" encoding="utf-8"?>
-<w:document xmlns:wpc="http://schemas.microsoft.com/office/word/2010/wordprocessingCanvas" xmlns:cx="http://schemas.microsoft.com/office/drawing/2014/chartex" xmlns:cx1="http://schemas.microsoft.com/office/drawing/2015/9/8/chartex" xmlns:cx2="http://schemas.microsoft.com/office/drawing/2015/10/21/chartex" xmlns:cx3="http://schemas.microsoft.com/office/drawing/2016/5/9/chartex" xmlns:cx4="http://schemas.microsoft.com/office/drawing/2016/5/10/chartex" xmlns:cx5="http://schemas.microsoft.com/office/drawing/2016/5/11/chartex" xmlns:cx6="http://schemas.microsoft.com/office/drawing/2016/5/12/chartex" xmlns:cx7="http://schemas.microsoft.com/office/drawing/2016/5/13/chartex" xmlns:cx8="http://schemas.microsoft.com/office/drawing/2016/5/14/chartex" xmlns:mc="http://schemas.openxmlformats.org/markup-compatibility/2006" xmlns:aink="http://schemas.microsoft.com/office/drawing/2016/ink" xmlns:am3d="http://schemas.microsoft.com/office/drawing/2017/model3d" xmlns:o="urn:schemas-microsoft-com:office:office" xmlns:oel="http://schemas.microsoft.com/office/2019/extlst" xmlns:r="http://schemas.openxmlformats.org/officeDocument/2006/relationships" xmlns:m="http://schemas.openxmlformats.org/officeDocument/2006/math" xmlns:v="urn:schemas-microsoft-com:vml" xmlns:wp14="http://schemas.microsoft.com/office/word/2010/wordprocessingDrawing" xmlns:wp="http://schemas.openxmlformats.org/drawingml/2006/wordprocessingDrawing" xmlns:w10="urn:schemas-microsoft-com:office:word" xmlns:w="http://schemas.openxmlformats.org/wordprocessingml/2006/main" xmlns:w14="http://schemas.microsoft.com/office/word/2010/wordml" xmlns:w15="http://schemas.microsoft.com/office/word/2012/wordml" xmlns:w16cex="http://schemas.microsoft.com/office/word/2018/wordml/cex" xmlns:w16cid="http://schemas.microsoft.com/office/word/2016/wordml/cid" xmlns:w16="http://schemas.microsoft.com/office/word/2018/wordml" xmlns:w16sdtdh="http://schemas.microsoft.com/office/word/2020/wordml/sdtdatahash" xmlns:w16se="http://schemas.microsoft.com/office/word/2015/wordml/symex" xmlns:wpg="http://schemas.microsoft.com/office/word/2010/wordprocessingGroup" xmlns:wpi="http://schemas.microsoft.com/office/word/2010/wordprocessingInk" xmlns:wne="http://schemas.microsoft.com/office/word/2006/wordml" xmlns:wps="http://schemas.microsoft.com/office/word/2010/wordprocessingShape" mc:Ignorable="w14 w15 w16se w16cid w16 w16cex w16sdtdh wp14">
+<w:document xmlns:wpc="http://schemas.microsoft.com/office/word/2010/wordprocessingCanvas" xmlns:cx="http://schemas.microsoft.com/office/drawing/2014/chartex" xmlns:cx1="http://schemas.microsoft.com/office/drawing/2015/9/8/chartex" xmlns:cx2="http://schemas.microsoft.com/office/drawing/2015/10/21/chartex" xmlns:cx3="http://schemas.microsoft.com/office/drawing/2016/5/9/chartex" xmlns:cx4="http://schemas.microsoft.com/office/drawing/2016/5/10/chartex" xmlns:cx5="http://schemas.microsoft.com/office/drawing/2016/5/11/chartex" xmlns:cx6="http://schemas.microsoft.com/office/drawing/2016/5/12/chartex" xmlns:cx7="http://schemas.microsoft.com/office/drawing/2016/5/13/chartex" xmlns:cx8="http://schemas.microsoft.com/office/drawing/2016/5/14/chartex" xmlns:mc="http://schemas.openxmlformats.org/markup-compatibility/2006" xmlns:aink="http://schemas.microsoft.com/office/drawing/2016/ink" xmlns:am3d="http://schemas.microsoft.com/office/drawing/2017/model3d" xmlns:o="urn:schemas-microsoft-com:office:office" xmlns:oel="http://schemas.microsoft.com/office/2019/extlst" xmlns:r="http://schemas.openxmlformats.org/officeDocument/2006/relationships" xmlns:m="http://schemas.openxmlformats.org/officeDocument/2006/math" xmlns:v="urn:schemas-microsoft-com:vml" xmlns:wp14="http://schemas.microsoft.com/office/word/2010/wordprocessingDrawing" xmlns:wp="http://schemas.openxmlformats.org/drawingml/2006/wordprocessingDrawing" xmlns:w10="urn:schemas-microsoft-com:office:word" xmlns:w="http://schemas.openxmlformats.org/wordprocessingml/2006/main" xmlns:w14="http://schemas.microsoft.com/office/word/2010/wordml" xmlns:w15="http://schemas.microsoft.com/office/word/2012/wordml" xmlns:w16cex="http://schemas.microsoft.com/office/word/2018/wordml/cex" xmlns:w16cid="http://schemas.microsoft.com/office/word/2016/wordml/cid" xmlns:w16="http://schemas.microsoft.com/office/word/2018/wordml" xmlns:w16du="http://schemas.microsoft.com/office/word/2023/wordml/word16du" xmlns:w16sdtdh="http://schemas.microsoft.com/office/word/2020/wordml/sdtdatahash" xmlns:w16sdtfl="http://schemas.microsoft.com/office/word/2024/wordml/sdtformatlock" xmlns:w16se="http://schemas.microsoft.com/office/word/2015/wordml/symex" xmlns:wpg="http://schemas.microsoft.com/office/word/2010/wordprocessingGroup" xmlns:wpi="http://schemas.microsoft.com/office/word/2010/wordprocessingInk" xmlns:wne="http://schemas.microsoft.com/office/word/2006/wordml" xmlns:wps="http://schemas.microsoft.com/office/word/2010/wordprocessingShape" mc:Ignorable="w14 w15 w16se w16cid w16 w16cex w16sdtdh w16sdtfl w16du wp14">
   <w:body>
     <w:p>
       <w:pPr>
@@ -71,7 +71,16 @@
           <w:color w:val="FF0000"/>
           <w:szCs w:val="24"/>
         </w:rPr>
-        <w:t xml:space="preserve"> non – contrôlées </w:t>
+        <w:t xml:space="preserve"> non – </w:t>
+      </w:r>
+      <w:proofErr w:type="gramStart"/>
+      <w:r>
+        <w:rPr>
+          <w:rFonts w:cs="Courier New"/>
+          <w:color w:val="FF0000"/>
+          <w:szCs w:val="24"/>
+        </w:rPr>
+        <w:t xml:space="preserve">contrôlées </w:t>
       </w:r>
       <w:r>
         <w:rPr>
@@ -80,6 +89,7 @@
         </w:rPr>
         <w:t>)</w:t>
       </w:r>
+      <w:proofErr w:type="gramEnd"/>
     </w:p>
     <w:p>
       <w:pPr>
@@ -108,8 +118,20 @@
           <w:color w:val="FF0000"/>
           <w:szCs w:val="24"/>
         </w:rPr>
-        <w:t>provenant de sous-classes de RuntimeException</w:t>
-      </w:r>
+        <w:t xml:space="preserve">provenant de sous-classes de </w:t>
+      </w:r>
+      <w:proofErr w:type="spellStart"/>
+      <w:r>
+        <w:rPr>
+          <w:rFonts w:cs="Courier New"/>
+          <w:b/>
+          <w:bCs/>
+          <w:color w:val="FF0000"/>
+          <w:szCs w:val="24"/>
+        </w:rPr>
+        <w:t>RuntimeException</w:t>
+      </w:r>
+      <w:proofErr w:type="spellEnd"/>
       <w:r>
         <w:rPr>
           <w:rFonts w:cs="Courier New"/>
@@ -135,7 +157,39 @@
           <w:rFonts w:cs="Courier New"/>
           <w:szCs w:val="24"/>
         </w:rPr>
-        <w:t>Bloc try/catch/finally pour régler les problème</w:t>
+        <w:t xml:space="preserve">Bloc </w:t>
+      </w:r>
+      <w:proofErr w:type="spellStart"/>
+      <w:r>
+        <w:rPr>
+          <w:rFonts w:cs="Courier New"/>
+          <w:szCs w:val="24"/>
+        </w:rPr>
+        <w:t>try</w:t>
+      </w:r>
+      <w:proofErr w:type="spellEnd"/>
+      <w:r>
+        <w:rPr>
+          <w:rFonts w:cs="Courier New"/>
+          <w:szCs w:val="24"/>
+        </w:rPr>
+        <w:t>/catch/</w:t>
+      </w:r>
+      <w:proofErr w:type="spellStart"/>
+      <w:r>
+        <w:rPr>
+          <w:rFonts w:cs="Courier New"/>
+          <w:szCs w:val="24"/>
+        </w:rPr>
+        <w:t>finally</w:t>
+      </w:r>
+      <w:proofErr w:type="spellEnd"/>
+      <w:r>
+        <w:rPr>
+          <w:rFonts w:cs="Courier New"/>
+          <w:szCs w:val="24"/>
+        </w:rPr>
+        <w:t xml:space="preserve"> pour régler les problème</w:t>
       </w:r>
       <w:r>
         <w:rPr>
@@ -211,8 +265,22 @@
           <w:sz w:val="26"/>
           <w:szCs w:val="26"/>
         </w:rPr>
-        <w:t>des sous-classes de RuntimeException</w:t>
-      </w:r>
+        <w:t xml:space="preserve">des sous-classes de </w:t>
+      </w:r>
+      <w:proofErr w:type="spellStart"/>
+      <w:r>
+        <w:rPr>
+          <w:rFonts w:eastAsiaTheme="majorEastAsia" w:cstheme="majorBidi"/>
+          <w:b/>
+          <w:bCs/>
+          <w:iCs/>
+          <w:color w:val="FF0000"/>
+          <w:sz w:val="26"/>
+          <w:szCs w:val="26"/>
+        </w:rPr>
+        <w:t>RuntimeException</w:t>
+      </w:r>
+      <w:proofErr w:type="spellEnd"/>
     </w:p>
     <w:p>
       <w:pPr>
@@ -222,8 +290,13 @@
           <w:numId w:val="41"/>
         </w:numPr>
       </w:pPr>
-      <w:r>
-        <w:t>IOException : exception d’entrée / sortie pour des fichiers externes</w:t>
+      <w:proofErr w:type="spellStart"/>
+      <w:r>
+        <w:t>IOException</w:t>
+      </w:r>
+      <w:proofErr w:type="spellEnd"/>
+      <w:r>
+        <w:t> : exception d’entrée / sortie pour des fichiers externes</w:t>
       </w:r>
     </w:p>
     <w:p>
@@ -234,8 +307,13 @@
           <w:numId w:val="41"/>
         </w:numPr>
       </w:pPr>
-      <w:r>
-        <w:t>FileNotFoundException : exception si le fichier à accéder n’est pas trouvé / n’existe pas</w:t>
+      <w:proofErr w:type="spellStart"/>
+      <w:r>
+        <w:t>FileNotFoundException</w:t>
+      </w:r>
+      <w:proofErr w:type="spellEnd"/>
+      <w:r>
+        <w:t> : exception si le fichier à accéder n’est pas trouvé / n’existe pas</w:t>
       </w:r>
     </w:p>
     <w:p>
@@ -246,8 +324,13 @@
           <w:numId w:val="41"/>
         </w:numPr>
       </w:pPr>
-      <w:r>
-        <w:t>SQLException : problème avec l’accès aux tables SQL</w:t>
+      <w:proofErr w:type="spellStart"/>
+      <w:r>
+        <w:t>SQLException</w:t>
+      </w:r>
+      <w:proofErr w:type="spellEnd"/>
+      <w:r>
+        <w:t> : problème avec l’accès aux tables SQL</w:t>
       </w:r>
     </w:p>
     <w:p>
@@ -283,7 +366,15 @@
         <w:t xml:space="preserve"> de l'annexe 8</w:t>
       </w:r>
       <w:r>
-        <w:t>, gérer à l’aide d’une structure try /catch les montants inférieurs à 0 $</w:t>
+        <w:t xml:space="preserve">, gérer à l’aide d’une structure </w:t>
+      </w:r>
+      <w:proofErr w:type="spellStart"/>
+      <w:r>
+        <w:t>try</w:t>
+      </w:r>
+      <w:proofErr w:type="spellEnd"/>
+      <w:r>
+        <w:t> /catch les montants inférieurs à 0 $</w:t>
       </w:r>
     </w:p>
     <w:p>
@@ -291,7 +382,27 @@
         <w:t xml:space="preserve">Où lancera-t-on cette exception ? </w:t>
       </w:r>
     </w:p>
-    <w:p/>
+    <w:p>
+      <w:r>
+        <w:t>Lancer l’</w:t>
+      </w:r>
+      <w:proofErr w:type="spellStart"/>
+      <w:r>
+        <w:t>exeption</w:t>
+      </w:r>
+      <w:proofErr w:type="spellEnd"/>
+      <w:r>
+        <w:t xml:space="preserve"> plus haut avec </w:t>
+      </w:r>
+      <w:proofErr w:type="spellStart"/>
+      <w:r>
+        <w:t>throws</w:t>
+      </w:r>
+      <w:proofErr w:type="spellEnd"/>
+      <w:r>
+        <w:t xml:space="preserve"> </w:t>
+      </w:r>
+    </w:p>
     <w:p>
       <w:r>
         <w:t>Où la captera-t-on ?</w:t>
@@ -338,7 +449,15 @@
             </w:numPr>
           </w:pPr>
           <w:r>
-            <w:t>Faire une structure try/catch</w:t>
+            <w:t xml:space="preserve">Faire une structure </w:t>
+          </w:r>
+          <w:proofErr w:type="spellStart"/>
+          <w:r>
+            <w:t>try</w:t>
+          </w:r>
+          <w:proofErr w:type="spellEnd"/>
+          <w:r>
+            <w:t>/catch</w:t>
           </w:r>
         </w:p>
       </w:sdtContent>
@@ -383,13 +502,8 @@
             </w:tabs>
           </w:pPr>
           <w:r>
-            <w:t xml:space="preserve">Lance explicitement l’exception dans la pile d’appel pour qu’elle soit captée plus </w:t>
+            <w:t>Lance explicitement l’exception dans la pile d’appel pour qu’elle soit captée plus tard</w:t>
           </w:r>
-          <w:proofErr w:type="gramStart"/>
-          <w:r>
-            <w:t>tard</w:t>
-          </w:r>
-          <w:proofErr w:type="gramEnd"/>
         </w:p>
       </w:sdtContent>
     </w:sdt>
@@ -401,109 +515,34 @@
           <w:lang w:val="en-CA"/>
         </w:rPr>
       </w:pPr>
+      <w:proofErr w:type="spellStart"/>
       <w:proofErr w:type="gramStart"/>
       <w:r>
         <w:rPr>
           <w:lang w:val="en-CA"/>
         </w:rPr>
-        <w:t>Exercice :</w:t>
+        <w:t>Exercice</w:t>
+      </w:r>
+      <w:proofErr w:type="spellEnd"/>
+      <w:r>
+        <w:rPr>
+          <w:lang w:val="en-CA"/>
+        </w:rPr>
+        <w:t> :</w:t>
       </w:r>
       <w:proofErr w:type="gramEnd"/>
       <w:r>
         <w:rPr>
           <w:lang w:val="en-CA"/>
         </w:rPr>
-        <w:t xml:space="preserve"> trace :</w:t>
-      </w:r>
-    </w:p>
-    <w:p>
-      <w:pPr>
-        <w:spacing w:after="0"/>
-        <w:rPr>
-          <w:lang w:val="en-CA"/>
-        </w:rPr>
-      </w:pPr>
-      <w:r>
-        <w:rPr>
-          <w:lang w:val="en-CA"/>
-        </w:rPr>
-        <w:t>public class ExempleException {</w:t>
-      </w:r>
-    </w:p>
-    <w:p>
-      <w:pPr>
-        <w:spacing w:after="0"/>
-        <w:rPr>
-          <w:lang w:val="en-CA"/>
-        </w:rPr>
-      </w:pPr>
-    </w:p>
-    <w:p>
-      <w:pPr>
-        <w:spacing w:after="0"/>
-        <w:rPr>
-          <w:lang w:val="en-CA"/>
-        </w:rPr>
-      </w:pPr>
-      <w:r>
-        <w:rPr>
-          <w:lang w:val="en-CA"/>
-        </w:rPr>
-        <w:t>public sta</w:t>
-      </w:r>
-      <w:r>
-        <w:rPr>
-          <w:lang w:val="en-CA"/>
-        </w:rPr>
-        <w:t xml:space="preserve">tic void main </w:t>
+        <w:t xml:space="preserve"> </w:t>
       </w:r>
       <w:proofErr w:type="gramStart"/>
       <w:r>
         <w:rPr>
           <w:lang w:val="en-CA"/>
         </w:rPr>
-        <w:t>( String</w:t>
-      </w:r>
-      <w:proofErr w:type="gramEnd"/>
-      <w:r>
-        <w:rPr>
-          <w:lang w:val="en-CA"/>
-        </w:rPr>
-        <w:t xml:space="preserve"> [] args ){</w:t>
-      </w:r>
-    </w:p>
-    <w:p>
-      <w:pPr>
-        <w:spacing w:after="0"/>
-      </w:pPr>
-      <w:r>
-        <w:rPr>
-          <w:lang w:val="en-CA"/>
-        </w:rPr>
-        <w:tab/>
-      </w:r>
-      <w:r>
-        <w:t xml:space="preserve">ExempleException ex = new </w:t>
-      </w:r>
-      <w:proofErr w:type="gramStart"/>
-      <w:r>
-        <w:t>ExempleException(</w:t>
-      </w:r>
-      <w:proofErr w:type="gramEnd"/>
-      <w:r>
-        <w:t>);</w:t>
-      </w:r>
-    </w:p>
-    <w:p>
-      <w:pPr>
-        <w:spacing w:after="0"/>
-      </w:pPr>
-      <w:r>
-        <w:tab/>
-      </w:r>
-      <w:proofErr w:type="gramStart"/>
-      <w:r>
-        <w:t>try{</w:t>
+        <w:t>trace :</w:t>
       </w:r>
       <w:proofErr w:type="gramEnd"/>
     </w:p>
@@ -515,24 +554,24 @@
         </w:rPr>
       </w:pPr>
       <w:r>
-        <w:tab/>
-      </w:r>
-      <w:r>
-        <w:tab/>
-      </w:r>
-      <w:proofErr w:type="gramStart"/>
-      <w:r>
-        <w:rPr>
-          <w:lang w:val="en-CA"/>
-        </w:rPr>
-        <w:t>ex.lancerException</w:t>
-      </w:r>
-      <w:proofErr w:type="gramEnd"/>
-      <w:r>
-        <w:rPr>
-          <w:lang w:val="en-CA"/>
-        </w:rPr>
-        <w:t>();</w:t>
+        <w:rPr>
+          <w:lang w:val="en-CA"/>
+        </w:rPr>
+        <w:t xml:space="preserve">public class </w:t>
+      </w:r>
+      <w:proofErr w:type="spellStart"/>
+      <w:r>
+        <w:rPr>
+          <w:lang w:val="en-CA"/>
+        </w:rPr>
+        <w:t>ExempleException</w:t>
+      </w:r>
+      <w:proofErr w:type="spellEnd"/>
+      <w:r>
+        <w:rPr>
+          <w:lang w:val="en-CA"/>
+        </w:rPr>
+        <w:t xml:space="preserve"> {</w:t>
       </w:r>
     </w:p>
     <w:p>
@@ -542,13 +581,6 @@
           <w:lang w:val="en-CA"/>
         </w:rPr>
       </w:pPr>
-      <w:r>
-        <w:rPr>
-          <w:lang w:val="en-CA"/>
-        </w:rPr>
-        <w:tab/>
-        <w:t>}</w:t>
-      </w:r>
     </w:p>
     <w:p>
       <w:pPr>
@@ -561,30 +593,54 @@
         <w:rPr>
           <w:lang w:val="en-CA"/>
         </w:rPr>
-        <w:tab/>
-        <w:t xml:space="preserve">catch </w:t>
+        <w:t>public sta</w:t>
+      </w:r>
+      <w:r>
+        <w:rPr>
+          <w:lang w:val="en-CA"/>
+        </w:rPr>
+        <w:t xml:space="preserve">tic void main </w:t>
       </w:r>
       <w:proofErr w:type="gramStart"/>
       <w:r>
         <w:rPr>
           <w:lang w:val="en-CA"/>
         </w:rPr>
-        <w:t>( Exception</w:t>
+        <w:t>( String</w:t>
       </w:r>
       <w:proofErr w:type="gramEnd"/>
       <w:r>
         <w:rPr>
           <w:lang w:val="en-CA"/>
         </w:rPr>
-        <w:t xml:space="preserve"> exception ){</w:t>
+        <w:t xml:space="preserve"> [] </w:t>
+      </w:r>
+      <w:proofErr w:type="spellStart"/>
+      <w:proofErr w:type="gramStart"/>
+      <w:r>
+        <w:rPr>
+          <w:lang w:val="en-CA"/>
+        </w:rPr>
+        <w:t>args</w:t>
+      </w:r>
+      <w:proofErr w:type="spellEnd"/>
+      <w:r>
+        <w:rPr>
+          <w:lang w:val="en-CA"/>
+        </w:rPr>
+        <w:t xml:space="preserve"> )</w:t>
+      </w:r>
+      <w:proofErr w:type="gramEnd"/>
+      <w:r>
+        <w:rPr>
+          <w:lang w:val="en-CA"/>
+        </w:rPr>
+        <w:t>{</w:t>
       </w:r>
     </w:p>
     <w:p>
       <w:pPr>
         <w:spacing w:after="0"/>
-        <w:rPr>
-          <w:lang w:val="fr-FR"/>
-        </w:rPr>
       </w:pPr>
       <w:r>
         <w:rPr>
@@ -592,170 +648,43 @@
         </w:rPr>
         <w:tab/>
       </w:r>
-      <w:r>
-        <w:rPr>
-          <w:lang w:val="en-CA"/>
-        </w:rPr>
-        <w:tab/>
-      </w:r>
-      <w:r>
-        <w:rPr>
-          <w:lang w:val="en-CA"/>
-        </w:rPr>
-        <w:t xml:space="preserve">System.out.println </w:t>
-      </w:r>
+      <w:proofErr w:type="spellStart"/>
+      <w:r>
+        <w:t>ExempleException</w:t>
+      </w:r>
+      <w:proofErr w:type="spellEnd"/>
+      <w:r>
+        <w:t xml:space="preserve"> ex = new </w:t>
+      </w:r>
+      <w:proofErr w:type="spellStart"/>
       <w:proofErr w:type="gramStart"/>
       <w:r>
-        <w:rPr>
-          <w:lang w:val="en-CA"/>
-        </w:rPr>
-        <w:t>( "</w:t>
+        <w:t>ExempleException</w:t>
+      </w:r>
+      <w:proofErr w:type="spellEnd"/>
+      <w:r>
+        <w:t>(</w:t>
       </w:r>
       <w:proofErr w:type="gramEnd"/>
       <w:r>
-        <w:rPr>
-          <w:lang w:val="en-CA"/>
-        </w:rPr>
-        <w:t xml:space="preserve"> 1. </w:t>
-      </w:r>
-      <w:r>
-        <w:rPr>
-          <w:lang w:val="fr-FR"/>
-        </w:rPr>
-        <w:t xml:space="preserve">Exception traitée par le main </w:t>
-      </w:r>
-      <w:proofErr w:type="gramStart"/>
-      <w:r>
-        <w:rPr>
-          <w:lang w:val="fr-FR"/>
-        </w:rPr>
-        <w:t>" )</w:t>
-      </w:r>
-      <w:proofErr w:type="gramEnd"/>
-      <w:r>
-        <w:rPr>
-          <w:lang w:val="fr-FR"/>
-        </w:rPr>
-        <w:t>;</w:t>
+        <w:t>);</w:t>
       </w:r>
     </w:p>
     <w:p>
       <w:pPr>
         <w:spacing w:after="0"/>
-        <w:rPr>
-          <w:lang w:val="en-CA"/>
-        </w:rPr>
-      </w:pPr>
-      <w:r>
-        <w:rPr>
-          <w:lang w:val="fr-FR"/>
-        </w:rPr>
+      </w:pPr>
+      <w:r>
         <w:tab/>
       </w:r>
-      <w:r>
-        <w:rPr>
-          <w:lang w:val="en-CA"/>
-        </w:rPr>
-        <w:t>}</w:t>
-      </w:r>
-    </w:p>
-    <w:p>
-      <w:pPr>
-        <w:spacing w:after="0"/>
-        <w:rPr>
-          <w:lang w:val="en-CA"/>
-        </w:rPr>
-      </w:pPr>
-      <w:r>
-        <w:rPr>
-          <w:lang w:val="en-CA"/>
-        </w:rPr>
-        <w:tab/>
-      </w:r>
+      <w:proofErr w:type="spellStart"/>
       <w:proofErr w:type="gramStart"/>
       <w:r>
-        <w:rPr>
-          <w:lang w:val="en-CA"/>
-        </w:rPr>
-        <w:t>ex.nePasLancerException</w:t>
-      </w:r>
-      <w:proofErr w:type="gramEnd"/>
-      <w:r>
-        <w:rPr>
-          <w:lang w:val="en-CA"/>
-        </w:rPr>
-        <w:t>();</w:t>
-      </w:r>
-    </w:p>
-    <w:p>
-      <w:pPr>
-        <w:spacing w:after="0"/>
-        <w:rPr>
-          <w:lang w:val="en-CA"/>
-        </w:rPr>
-      </w:pPr>
-      <w:r>
-        <w:rPr>
-          <w:lang w:val="en-CA"/>
-        </w:rPr>
-        <w:t>}</w:t>
-      </w:r>
-    </w:p>
-    <w:p>
-      <w:pPr>
-        <w:spacing w:after="0"/>
-        <w:rPr>
-          <w:lang w:val="en-CA"/>
-        </w:rPr>
-      </w:pPr>
-    </w:p>
-    <w:p>
-      <w:pPr>
-        <w:spacing w:after="0"/>
-        <w:rPr>
-          <w:lang w:val="en-CA"/>
-        </w:rPr>
-      </w:pPr>
-      <w:r>
-        <w:rPr>
-          <w:lang w:val="en-CA"/>
-        </w:rPr>
-        <w:t>public void lancerException () throws Exception {</w:t>
-      </w:r>
-    </w:p>
-    <w:p>
-      <w:pPr>
-        <w:spacing w:after="0"/>
-        <w:rPr>
-          <w:lang w:val="en-CA"/>
-        </w:rPr>
-      </w:pPr>
-      <w:r>
-        <w:rPr>
-          <w:lang w:val="en-CA"/>
-        </w:rPr>
-        <w:tab/>
-      </w:r>
-    </w:p>
-    <w:p>
-      <w:pPr>
-        <w:spacing w:after="0"/>
-        <w:rPr>
-          <w:lang w:val="en-CA"/>
-        </w:rPr>
-      </w:pPr>
-      <w:r>
-        <w:rPr>
-          <w:lang w:val="en-CA"/>
-        </w:rPr>
-        <w:tab/>
-      </w:r>
-      <w:proofErr w:type="gramStart"/>
-      <w:r>
-        <w:rPr>
-          <w:lang w:val="en-CA"/>
-        </w:rPr>
-        <w:t>try{</w:t>
+        <w:t>try</w:t>
+      </w:r>
+      <w:proofErr w:type="spellEnd"/>
+      <w:r>
+        <w:t>{</w:t>
       </w:r>
       <w:proofErr w:type="gramEnd"/>
     </w:p>
@@ -763,224 +692,37 @@
       <w:pPr>
         <w:spacing w:after="0"/>
         <w:rPr>
-          <w:lang w:val="fr-FR"/>
-        </w:rPr>
-      </w:pPr>
-      <w:r>
-        <w:rPr>
-          <w:lang w:val="en-CA"/>
-        </w:rPr>
+          <w:lang w:val="en-CA"/>
+        </w:rPr>
+      </w:pPr>
+      <w:r>
         <w:tab/>
       </w:r>
       <w:r>
-        <w:rPr>
-          <w:lang w:val="en-CA"/>
-        </w:rPr>
         <w:tab/>
       </w:r>
-      <w:r>
-        <w:rPr>
-          <w:lang w:val="fr-FR"/>
-        </w:rPr>
-        <w:t xml:space="preserve">System.out.println </w:t>
-      </w:r>
+      <w:proofErr w:type="spellStart"/>
       <w:proofErr w:type="gramStart"/>
       <w:r>
         <w:rPr>
-          <w:lang w:val="fr-FR"/>
-        </w:rPr>
-        <w:t>( "</w:t>
-      </w:r>
+          <w:lang w:val="en-CA"/>
+        </w:rPr>
+        <w:t>ex.lancerException</w:t>
+      </w:r>
+      <w:proofErr w:type="spellEnd"/>
       <w:proofErr w:type="gramEnd"/>
       <w:r>
         <w:rPr>
-          <w:lang w:val="fr-FR"/>
-        </w:rPr>
-        <w:t xml:space="preserve">2. Méthode lancerException </w:t>
+          <w:lang w:val="en-CA"/>
+        </w:rPr>
+        <w:t>(</w:t>
       </w:r>
       <w:proofErr w:type="gramStart"/>
       <w:r>
         <w:rPr>
-          <w:lang w:val="fr-FR"/>
-        </w:rPr>
-        <w:t>" )</w:t>
-      </w:r>
-      <w:proofErr w:type="gramEnd"/>
-      <w:r>
-        <w:rPr>
-          <w:lang w:val="fr-FR"/>
-        </w:rPr>
-        <w:t>;</w:t>
-      </w:r>
-    </w:p>
-    <w:p>
-      <w:pPr>
-        <w:spacing w:after="0"/>
-        <w:rPr>
-          <w:lang w:val="en-CA"/>
-        </w:rPr>
-      </w:pPr>
-      <w:r>
-        <w:rPr>
-          <w:lang w:val="fr-FR"/>
-        </w:rPr>
-        <w:tab/>
-      </w:r>
-      <w:r>
-        <w:rPr>
-          <w:lang w:val="fr-FR"/>
-        </w:rPr>
-        <w:tab/>
-      </w:r>
-      <w:r>
-        <w:rPr>
-          <w:lang w:val="en-CA"/>
-        </w:rPr>
-        <w:t xml:space="preserve">throw new </w:t>
-      </w:r>
-      <w:proofErr w:type="gramStart"/>
-      <w:r>
-        <w:rPr>
-          <w:lang w:val="en-CA"/>
-        </w:rPr>
-        <w:t>Exception(</w:t>
-      </w:r>
-      <w:proofErr w:type="gramEnd"/>
-      <w:r>
-        <w:rPr>
           <w:lang w:val="en-CA"/>
         </w:rPr>
         <w:t>);</w:t>
-      </w:r>
-    </w:p>
-    <w:p>
-      <w:pPr>
-        <w:spacing w:after="0"/>
-        <w:rPr>
-          <w:lang w:val="en-CA"/>
-        </w:rPr>
-      </w:pPr>
-      <w:r>
-        <w:rPr>
-          <w:lang w:val="en-CA"/>
-        </w:rPr>
-        <w:tab/>
-        <w:t>}</w:t>
-      </w:r>
-    </w:p>
-    <w:p>
-      <w:pPr>
-        <w:spacing w:after="0"/>
-        <w:rPr>
-          <w:lang w:val="en-CA"/>
-        </w:rPr>
-      </w:pPr>
-    </w:p>
-    <w:p>
-      <w:pPr>
-        <w:spacing w:after="0"/>
-        <w:rPr>
-          <w:lang w:val="en-CA"/>
-        </w:rPr>
-      </w:pPr>
-      <w:r>
-        <w:rPr>
-          <w:lang w:val="en-CA"/>
-        </w:rPr>
-        <w:tab/>
-      </w:r>
-      <w:r>
-        <w:rPr>
-          <w:lang w:val="en-CA"/>
-        </w:rPr>
-        <w:t xml:space="preserve">catch </w:t>
-      </w:r>
-      <w:proofErr w:type="gramStart"/>
-      <w:r>
-        <w:rPr>
-          <w:lang w:val="en-CA"/>
-        </w:rPr>
-        <w:t>( Exception</w:t>
-      </w:r>
-      <w:proofErr w:type="gramEnd"/>
-      <w:r>
-        <w:rPr>
-          <w:lang w:val="en-CA"/>
-        </w:rPr>
-        <w:t xml:space="preserve"> exception ){</w:t>
-      </w:r>
-    </w:p>
-    <w:p>
-      <w:pPr>
-        <w:spacing w:after="0"/>
-        <w:rPr>
-          <w:lang w:val="fr-FR"/>
-        </w:rPr>
-      </w:pPr>
-      <w:r>
-        <w:rPr>
-          <w:lang w:val="en-CA"/>
-        </w:rPr>
-        <w:tab/>
-      </w:r>
-      <w:r>
-        <w:rPr>
-          <w:lang w:val="en-CA"/>
-        </w:rPr>
-        <w:tab/>
-      </w:r>
-      <w:r>
-        <w:rPr>
-          <w:lang w:val="fr-FR"/>
-        </w:rPr>
-        <w:t xml:space="preserve">System.out.println </w:t>
-      </w:r>
-      <w:proofErr w:type="gramStart"/>
-      <w:r>
-        <w:rPr>
-          <w:lang w:val="fr-FR"/>
-        </w:rPr>
-        <w:t>( "</w:t>
-      </w:r>
-      <w:proofErr w:type="gramEnd"/>
-      <w:r>
-        <w:rPr>
-          <w:lang w:val="fr-FR"/>
-        </w:rPr>
-        <w:t>3.Exception traitée dans lancerException");</w:t>
-      </w:r>
-    </w:p>
-    <w:p>
-      <w:pPr>
-        <w:spacing w:after="0"/>
-        <w:rPr>
-          <w:lang w:val="en-CA"/>
-        </w:rPr>
-      </w:pPr>
-      <w:r>
-        <w:rPr>
-          <w:lang w:val="fr-FR"/>
-        </w:rPr>
-        <w:tab/>
-      </w:r>
-      <w:r>
-        <w:rPr>
-          <w:lang w:val="fr-FR"/>
-        </w:rPr>
-        <w:tab/>
-      </w:r>
-      <w:r>
-        <w:rPr>
-          <w:lang w:val="en-CA"/>
-        </w:rPr>
-        <w:t xml:space="preserve">throw </w:t>
-      </w:r>
-      <w:proofErr w:type="gramStart"/>
-      <w:r>
-        <w:rPr>
-          <w:lang w:val="en-CA"/>
-        </w:rPr>
-        <w:t>exception;</w:t>
       </w:r>
       <w:proofErr w:type="gramEnd"/>
     </w:p>
@@ -1011,13 +753,168 @@
           <w:lang w:val="en-CA"/>
         </w:rPr>
         <w:tab/>
+        <w:t xml:space="preserve">catch </w:t>
       </w:r>
       <w:proofErr w:type="gramStart"/>
       <w:r>
         <w:rPr>
           <w:lang w:val="en-CA"/>
         </w:rPr>
-        <w:t>finally{</w:t>
+        <w:t>( Exception</w:t>
+      </w:r>
+      <w:proofErr w:type="gramEnd"/>
+      <w:r>
+        <w:rPr>
+          <w:lang w:val="en-CA"/>
+        </w:rPr>
+        <w:t xml:space="preserve"> </w:t>
+      </w:r>
+      <w:proofErr w:type="spellStart"/>
+      <w:proofErr w:type="gramStart"/>
+      <w:r>
+        <w:rPr>
+          <w:lang w:val="en-CA"/>
+        </w:rPr>
+        <w:t>exception</w:t>
+      </w:r>
+      <w:proofErr w:type="spellEnd"/>
+      <w:r>
+        <w:rPr>
+          <w:lang w:val="en-CA"/>
+        </w:rPr>
+        <w:t xml:space="preserve"> )</w:t>
+      </w:r>
+      <w:proofErr w:type="gramEnd"/>
+      <w:r>
+        <w:rPr>
+          <w:lang w:val="en-CA"/>
+        </w:rPr>
+        <w:t>{</w:t>
+      </w:r>
+    </w:p>
+    <w:p>
+      <w:pPr>
+        <w:spacing w:after="0"/>
+        <w:rPr>
+          <w:lang w:val="fr-FR"/>
+        </w:rPr>
+      </w:pPr>
+      <w:r>
+        <w:rPr>
+          <w:lang w:val="en-CA"/>
+        </w:rPr>
+        <w:tab/>
+      </w:r>
+      <w:r>
+        <w:rPr>
+          <w:lang w:val="en-CA"/>
+        </w:rPr>
+        <w:tab/>
+      </w:r>
+      <w:proofErr w:type="spellStart"/>
+      <w:r>
+        <w:rPr>
+          <w:lang w:val="en-CA"/>
+        </w:rPr>
+        <w:t>System.out.println</w:t>
+      </w:r>
+      <w:proofErr w:type="spellEnd"/>
+      <w:r>
+        <w:rPr>
+          <w:lang w:val="en-CA"/>
+        </w:rPr>
+        <w:t xml:space="preserve"> </w:t>
+      </w:r>
+      <w:proofErr w:type="gramStart"/>
+      <w:r>
+        <w:rPr>
+          <w:lang w:val="en-CA"/>
+        </w:rPr>
+        <w:t>( "</w:t>
+      </w:r>
+      <w:proofErr w:type="gramEnd"/>
+      <w:r>
+        <w:rPr>
+          <w:lang w:val="en-CA"/>
+        </w:rPr>
+        <w:t xml:space="preserve"> 1. </w:t>
+      </w:r>
+      <w:r>
+        <w:rPr>
+          <w:lang w:val="fr-FR"/>
+        </w:rPr>
+        <w:t xml:space="preserve">Exception traitée par le main </w:t>
+      </w:r>
+      <w:proofErr w:type="gramStart"/>
+      <w:r>
+        <w:rPr>
+          <w:lang w:val="fr-FR"/>
+        </w:rPr>
+        <w:t>" )</w:t>
+      </w:r>
+      <w:proofErr w:type="gramEnd"/>
+      <w:r>
+        <w:rPr>
+          <w:lang w:val="fr-FR"/>
+        </w:rPr>
+        <w:t>;</w:t>
+      </w:r>
+    </w:p>
+    <w:p>
+      <w:pPr>
+        <w:spacing w:after="0"/>
+        <w:rPr>
+          <w:lang w:val="en-CA"/>
+        </w:rPr>
+      </w:pPr>
+      <w:r>
+        <w:rPr>
+          <w:lang w:val="fr-FR"/>
+        </w:rPr>
+        <w:tab/>
+      </w:r>
+      <w:r>
+        <w:rPr>
+          <w:lang w:val="en-CA"/>
+        </w:rPr>
+        <w:t>}</w:t>
+      </w:r>
+    </w:p>
+    <w:p>
+      <w:pPr>
+        <w:spacing w:after="0"/>
+        <w:rPr>
+          <w:lang w:val="en-CA"/>
+        </w:rPr>
+      </w:pPr>
+      <w:r>
+        <w:rPr>
+          <w:lang w:val="en-CA"/>
+        </w:rPr>
+        <w:tab/>
+      </w:r>
+      <w:proofErr w:type="spellStart"/>
+      <w:proofErr w:type="gramStart"/>
+      <w:r>
+        <w:rPr>
+          <w:lang w:val="en-CA"/>
+        </w:rPr>
+        <w:t>ex.nePasLancerException</w:t>
+      </w:r>
+      <w:proofErr w:type="spellEnd"/>
+      <w:proofErr w:type="gramEnd"/>
+      <w:r>
+        <w:rPr>
+          <w:lang w:val="en-CA"/>
+        </w:rPr>
+        <w:t>(</w:t>
+      </w:r>
+      <w:proofErr w:type="gramStart"/>
+      <w:r>
+        <w:rPr>
+          <w:lang w:val="en-CA"/>
+        </w:rPr>
+        <w:t>);</w:t>
       </w:r>
       <w:proofErr w:type="gramEnd"/>
     </w:p>
@@ -1032,141 +929,77 @@
         <w:rPr>
           <w:lang w:val="en-CA"/>
         </w:rPr>
-        <w:tab/>
-      </w:r>
-      <w:r>
-        <w:rPr>
-          <w:lang w:val="en-CA"/>
-        </w:rPr>
-        <w:tab/>
-        <w:t xml:space="preserve">System.out.println ("4. </w:t>
-      </w:r>
-      <w:proofErr w:type="gramStart"/>
-      <w:r>
-        <w:rPr>
-          <w:lang w:val="en-CA"/>
-        </w:rPr>
-        <w:t>finally</w:t>
-      </w:r>
-      <w:proofErr w:type="gramEnd"/>
-      <w:r>
-        <w:rPr>
-          <w:lang w:val="en-CA"/>
-        </w:rPr>
-        <w:t xml:space="preserve"> dans lancerException");</w:t>
+        <w:t>}</w:t>
       </w:r>
     </w:p>
     <w:p>
       <w:pPr>
         <w:spacing w:after="0"/>
         <w:rPr>
-          <w:lang w:val="fr-FR"/>
-        </w:rPr>
-      </w:pPr>
-      <w:r>
-        <w:rPr>
-          <w:lang w:val="en-CA"/>
-        </w:rPr>
-        <w:tab/>
-      </w:r>
-      <w:r>
-        <w:rPr>
-          <w:lang w:val="fr-FR"/>
-        </w:rPr>
-        <w:t>}</w:t>
-      </w:r>
+          <w:lang w:val="en-CA"/>
+        </w:rPr>
+      </w:pPr>
     </w:p>
     <w:p>
       <w:pPr>
         <w:spacing w:after="0"/>
         <w:rPr>
-          <w:lang w:val="fr-FR"/>
-        </w:rPr>
-      </w:pPr>
-      <w:r>
-        <w:rPr>
-          <w:lang w:val="fr-FR"/>
-        </w:rPr>
-        <w:tab/>
+          <w:lang w:val="en-CA"/>
+        </w:rPr>
+      </w:pPr>
+      <w:r>
+        <w:rPr>
+          <w:lang w:val="en-CA"/>
+        </w:rPr>
+        <w:t xml:space="preserve">public void </w:t>
+      </w:r>
+      <w:proofErr w:type="spellStart"/>
+      <w:r>
+        <w:rPr>
+          <w:lang w:val="en-CA"/>
+        </w:rPr>
+        <w:t>lancerException</w:t>
+      </w:r>
+      <w:proofErr w:type="spellEnd"/>
+      <w:r>
+        <w:rPr>
+          <w:lang w:val="en-CA"/>
+        </w:rPr>
+        <w:t xml:space="preserve"> () throws Exception {</w:t>
       </w:r>
     </w:p>
     <w:p>
       <w:pPr>
         <w:spacing w:after="0"/>
         <w:rPr>
-          <w:lang w:val="fr-FR"/>
-        </w:rPr>
-      </w:pPr>
-      <w:r>
-        <w:rPr>
-          <w:lang w:val="fr-FR"/>
-        </w:rPr>
-        <w:t>}</w:t>
+          <w:lang w:val="en-CA"/>
+        </w:rPr>
+      </w:pPr>
+      <w:r>
+        <w:rPr>
+          <w:lang w:val="en-CA"/>
+        </w:rPr>
+        <w:tab/>
       </w:r>
     </w:p>
     <w:p>
       <w:pPr>
         <w:spacing w:after="0"/>
-        <w:rPr>
-          <w:lang w:val="fr-FR"/>
-        </w:rPr>
-      </w:pPr>
-    </w:p>
-    <w:p>
-      <w:pPr>
-        <w:spacing w:after="0"/>
-        <w:rPr>
-          <w:lang w:val="fr-FR"/>
-        </w:rPr>
-      </w:pPr>
+      </w:pPr>
+      <w:r>
+        <w:rPr>
+          <w:lang w:val="en-CA"/>
+        </w:rPr>
+        <w:tab/>
+      </w:r>
+      <w:proofErr w:type="spellStart"/>
       <w:proofErr w:type="gramStart"/>
       <w:r>
-        <w:rPr>
-          <w:lang w:val="fr-FR"/>
-        </w:rPr>
-        <w:t>public</w:t>
-      </w:r>
-      <w:proofErr w:type="gramEnd"/>
-      <w:r>
-        <w:rPr>
-          <w:lang w:val="fr-FR"/>
-        </w:rPr>
-        <w:t xml:space="preserve"> void nePasLancerException (){</w:t>
-      </w:r>
-    </w:p>
-    <w:p>
-      <w:pPr>
-        <w:spacing w:after="0"/>
-        <w:rPr>
-          <w:lang w:val="fr-FR"/>
-        </w:rPr>
-      </w:pPr>
-      <w:r>
-        <w:rPr>
-          <w:lang w:val="fr-FR"/>
-        </w:rPr>
-        <w:tab/>
-      </w:r>
-    </w:p>
-    <w:p>
-      <w:pPr>
-        <w:spacing w:after="0"/>
-        <w:rPr>
-          <w:lang w:val="fr-FR"/>
-        </w:rPr>
-      </w:pPr>
-      <w:r>
-        <w:rPr>
-          <w:lang w:val="fr-FR"/>
-        </w:rPr>
-        <w:tab/>
-      </w:r>
-      <w:proofErr w:type="gramStart"/>
-      <w:r>
-        <w:rPr>
-          <w:lang w:val="fr-FR"/>
-        </w:rPr>
-        <w:t>try{</w:t>
+        <w:t>try</w:t>
+      </w:r>
+      <w:proofErr w:type="spellEnd"/>
+      <w:r>
+        <w:t>{</w:t>
       </w:r>
       <w:proofErr w:type="gramEnd"/>
     </w:p>
@@ -1178,31 +1011,66 @@
         </w:rPr>
       </w:pPr>
       <w:r>
+        <w:tab/>
+      </w:r>
+      <w:r>
+        <w:tab/>
+      </w:r>
+      <w:proofErr w:type="spellStart"/>
+      <w:r>
         <w:rPr>
           <w:lang w:val="fr-FR"/>
         </w:rPr>
-        <w:tab/>
-      </w:r>
+        <w:t>System.out.println</w:t>
+      </w:r>
+      <w:proofErr w:type="spellEnd"/>
       <w:r>
         <w:rPr>
           <w:lang w:val="fr-FR"/>
         </w:rPr>
-        <w:tab/>
-        <w:t>System.out.println ("</w:t>
+        <w:t xml:space="preserve"> </w:t>
       </w:r>
       <w:proofErr w:type="gramStart"/>
       <w:r>
         <w:rPr>
           <w:lang w:val="fr-FR"/>
         </w:rPr>
-        <w:t>6.Méthode</w:t>
+        <w:t>( "</w:t>
       </w:r>
       <w:proofErr w:type="gramEnd"/>
       <w:r>
         <w:rPr>
           <w:lang w:val="fr-FR"/>
         </w:rPr>
-        <w:t xml:space="preserve"> ne pas lancerException");</w:t>
+        <w:t xml:space="preserve">2. Méthode </w:t>
+      </w:r>
+      <w:proofErr w:type="spellStart"/>
+      <w:r>
+        <w:rPr>
+          <w:lang w:val="fr-FR"/>
+        </w:rPr>
+        <w:t>lancerException</w:t>
+      </w:r>
+      <w:proofErr w:type="spellEnd"/>
+      <w:r>
+        <w:rPr>
+          <w:lang w:val="fr-FR"/>
+        </w:rPr>
+        <w:t xml:space="preserve"> </w:t>
+      </w:r>
+      <w:proofErr w:type="gramStart"/>
+      <w:r>
+        <w:rPr>
+          <w:lang w:val="fr-FR"/>
+        </w:rPr>
+        <w:t>" )</w:t>
+      </w:r>
+      <w:proofErr w:type="gramEnd"/>
+      <w:r>
+        <w:rPr>
+          <w:lang w:val="fr-FR"/>
+        </w:rPr>
+        <w:t>;</w:t>
       </w:r>
     </w:p>
     <w:p>
@@ -1220,71 +1088,22 @@
       </w:r>
       <w:r>
         <w:rPr>
-          <w:lang w:val="en-CA"/>
-        </w:rPr>
-        <w:t>}</w:t>
-      </w:r>
-    </w:p>
-    <w:p>
-      <w:pPr>
-        <w:spacing w:after="0"/>
-        <w:rPr>
-          <w:lang w:val="en-CA"/>
-        </w:rPr>
-      </w:pPr>
-      <w:r>
-        <w:rPr>
-          <w:lang w:val="en-CA"/>
+          <w:lang w:val="fr-FR"/>
         </w:rPr>
         <w:tab/>
       </w:r>
+      <w:r>
+        <w:rPr>
+          <w:lang w:val="en-CA"/>
+        </w:rPr>
+        <w:t xml:space="preserve">throw new </w:t>
+      </w:r>
       <w:proofErr w:type="gramStart"/>
       <w:r>
         <w:rPr>
           <w:lang w:val="en-CA"/>
         </w:rPr>
-        <w:t>catch(</w:t>
-      </w:r>
-      <w:proofErr w:type="gramEnd"/>
-      <w:r>
-        <w:rPr>
-          <w:lang w:val="en-CA"/>
-        </w:rPr>
-        <w:t>Exception exception ){</w:t>
-      </w:r>
-    </w:p>
-    <w:p>
-      <w:pPr>
-        <w:spacing w:after="0"/>
-        <w:rPr>
-          <w:lang w:val="fr-FR"/>
-        </w:rPr>
-      </w:pPr>
-      <w:r>
-        <w:rPr>
-          <w:lang w:val="en-CA"/>
-        </w:rPr>
-        <w:tab/>
-      </w:r>
-      <w:r>
-        <w:rPr>
-          <w:lang w:val="en-CA"/>
-        </w:rPr>
-        <w:tab/>
-        <w:t xml:space="preserve">System.out.println ("7. </w:t>
-      </w:r>
-      <w:r>
-        <w:rPr>
-          <w:lang w:val="fr-FR"/>
-        </w:rPr>
-        <w:t>Exception dans nePasLancerException"</w:t>
-      </w:r>
-      <w:proofErr w:type="gramStart"/>
-      <w:r>
-        <w:rPr>
-          <w:lang w:val="fr-FR"/>
-        </w:rPr>
-        <w:t>);</w:t>
+        <w:t>Exception();</w:t>
       </w:r>
       <w:proofErr w:type="gramEnd"/>
     </w:p>
@@ -1292,12 +1111,12 @@
       <w:pPr>
         <w:spacing w:after="0"/>
         <w:rPr>
-          <w:lang w:val="fr-FR"/>
-        </w:rPr>
-      </w:pPr>
-      <w:r>
-        <w:rPr>
-          <w:lang w:val="fr-FR"/>
+          <w:lang w:val="en-CA"/>
+        </w:rPr>
+      </w:pPr>
+      <w:r>
+        <w:rPr>
+          <w:lang w:val="en-CA"/>
         </w:rPr>
         <w:tab/>
         <w:t>}</w:t>
@@ -1307,27 +1126,663 @@
       <w:pPr>
         <w:spacing w:after="0"/>
         <w:rPr>
+          <w:lang w:val="en-CA"/>
+        </w:rPr>
+      </w:pPr>
+    </w:p>
+    <w:p>
+      <w:pPr>
+        <w:spacing w:after="0"/>
+      </w:pPr>
+      <w:r>
+        <w:rPr>
+          <w:lang w:val="en-CA"/>
+        </w:rPr>
+        <w:tab/>
+      </w:r>
+      <w:proofErr w:type="gramStart"/>
+      <w:r>
+        <w:t>catch</w:t>
+      </w:r>
+      <w:proofErr w:type="gramEnd"/>
+      <w:r>
+        <w:t xml:space="preserve"> </w:t>
+      </w:r>
+      <w:proofErr w:type="gramStart"/>
+      <w:r>
+        <w:t>( Exception</w:t>
+      </w:r>
+      <w:proofErr w:type="gramEnd"/>
+      <w:r>
+        <w:t xml:space="preserve"> </w:t>
+      </w:r>
+      <w:proofErr w:type="spellStart"/>
+      <w:proofErr w:type="gramStart"/>
+      <w:r>
+        <w:t>exception</w:t>
+      </w:r>
+      <w:proofErr w:type="spellEnd"/>
+      <w:r>
+        <w:t xml:space="preserve"> )</w:t>
+      </w:r>
+      <w:proofErr w:type="gramEnd"/>
+      <w:r>
+        <w:t>{</w:t>
+      </w:r>
+    </w:p>
+    <w:p>
+      <w:pPr>
+        <w:spacing w:after="0"/>
+        <w:rPr>
           <w:lang w:val="fr-FR"/>
         </w:rPr>
       </w:pPr>
       <w:r>
+        <w:tab/>
+      </w:r>
+      <w:r>
+        <w:tab/>
+      </w:r>
+      <w:proofErr w:type="spellStart"/>
+      <w:r>
         <w:rPr>
           <w:lang w:val="fr-FR"/>
         </w:rPr>
-        <w:tab/>
+        <w:t>System.out.println</w:t>
+      </w:r>
+      <w:proofErr w:type="spellEnd"/>
+      <w:r>
+        <w:rPr>
+          <w:lang w:val="fr-FR"/>
+        </w:rPr>
+        <w:t xml:space="preserve"> </w:t>
       </w:r>
       <w:proofErr w:type="gramStart"/>
       <w:r>
         <w:rPr>
           <w:lang w:val="fr-FR"/>
         </w:rPr>
-        <w:t>finally{</w:t>
+        <w:t>( "3.Exception</w:t>
+      </w:r>
+      <w:proofErr w:type="gramEnd"/>
+      <w:r>
+        <w:rPr>
+          <w:lang w:val="fr-FR"/>
+        </w:rPr>
+        <w:t xml:space="preserve"> traitée dans </w:t>
+      </w:r>
+      <w:proofErr w:type="spellStart"/>
+      <w:r>
+        <w:rPr>
+          <w:lang w:val="fr-FR"/>
+        </w:rPr>
+        <w:t>lancerException</w:t>
+      </w:r>
+      <w:proofErr w:type="spellEnd"/>
+      <w:r>
+        <w:rPr>
+          <w:lang w:val="fr-FR"/>
+        </w:rPr>
+        <w:t>"</w:t>
+      </w:r>
+      <w:proofErr w:type="gramStart"/>
+      <w:r>
+        <w:rPr>
+          <w:lang w:val="fr-FR"/>
+        </w:rPr>
+        <w:t>);</w:t>
       </w:r>
       <w:proofErr w:type="gramEnd"/>
     </w:p>
     <w:p>
       <w:pPr>
         <w:spacing w:after="0"/>
+        <w:rPr>
+          <w:lang w:val="en-CA"/>
+        </w:rPr>
+      </w:pPr>
+      <w:r>
+        <w:rPr>
+          <w:lang w:val="fr-FR"/>
+        </w:rPr>
+        <w:tab/>
+      </w:r>
+      <w:r>
+        <w:rPr>
+          <w:lang w:val="fr-FR"/>
+        </w:rPr>
+        <w:tab/>
+      </w:r>
+      <w:r>
+        <w:rPr>
+          <w:lang w:val="en-CA"/>
+        </w:rPr>
+        <w:t xml:space="preserve">throw </w:t>
+      </w:r>
+      <w:proofErr w:type="gramStart"/>
+      <w:r>
+        <w:rPr>
+          <w:lang w:val="en-CA"/>
+        </w:rPr>
+        <w:t>exception;</w:t>
+      </w:r>
+      <w:proofErr w:type="gramEnd"/>
+    </w:p>
+    <w:p>
+      <w:pPr>
+        <w:spacing w:after="0"/>
+        <w:rPr>
+          <w:lang w:val="en-CA"/>
+        </w:rPr>
+      </w:pPr>
+      <w:r>
+        <w:rPr>
+          <w:lang w:val="en-CA"/>
+        </w:rPr>
+        <w:tab/>
+        <w:t>}</w:t>
+      </w:r>
+    </w:p>
+    <w:p>
+      <w:pPr>
+        <w:spacing w:after="0"/>
+        <w:rPr>
+          <w:lang w:val="en-CA"/>
+        </w:rPr>
+      </w:pPr>
+      <w:r>
+        <w:rPr>
+          <w:lang w:val="en-CA"/>
+        </w:rPr>
+        <w:tab/>
+      </w:r>
+      <w:proofErr w:type="gramStart"/>
+      <w:r>
+        <w:rPr>
+          <w:lang w:val="en-CA"/>
+        </w:rPr>
+        <w:t>finally{</w:t>
+      </w:r>
+      <w:proofErr w:type="gramEnd"/>
+    </w:p>
+    <w:p>
+      <w:pPr>
+        <w:spacing w:after="0"/>
+        <w:rPr>
+          <w:lang w:val="en-CA"/>
+        </w:rPr>
+      </w:pPr>
+      <w:r>
+        <w:rPr>
+          <w:lang w:val="en-CA"/>
+        </w:rPr>
+        <w:tab/>
+      </w:r>
+      <w:r>
+        <w:rPr>
+          <w:lang w:val="en-CA"/>
+        </w:rPr>
+        <w:tab/>
+      </w:r>
+      <w:proofErr w:type="spellStart"/>
+      <w:r>
+        <w:rPr>
+          <w:lang w:val="en-CA"/>
+        </w:rPr>
+        <w:t>System.out.println</w:t>
+      </w:r>
+      <w:proofErr w:type="spellEnd"/>
+      <w:r>
+        <w:rPr>
+          <w:lang w:val="en-CA"/>
+        </w:rPr>
+        <w:t xml:space="preserve"> ("4. </w:t>
+      </w:r>
+      <w:proofErr w:type="gramStart"/>
+      <w:r>
+        <w:rPr>
+          <w:lang w:val="en-CA"/>
+        </w:rPr>
+        <w:t>finally</w:t>
+      </w:r>
+      <w:proofErr w:type="gramEnd"/>
+      <w:r>
+        <w:rPr>
+          <w:lang w:val="en-CA"/>
+        </w:rPr>
+        <w:t xml:space="preserve"> dans </w:t>
+      </w:r>
+      <w:proofErr w:type="spellStart"/>
+      <w:r>
+        <w:rPr>
+          <w:lang w:val="en-CA"/>
+        </w:rPr>
+        <w:t>lancerException</w:t>
+      </w:r>
+      <w:proofErr w:type="spellEnd"/>
+      <w:r>
+        <w:rPr>
+          <w:lang w:val="en-CA"/>
+        </w:rPr>
+        <w:t>"</w:t>
+      </w:r>
+      <w:proofErr w:type="gramStart"/>
+      <w:r>
+        <w:rPr>
+          <w:lang w:val="en-CA"/>
+        </w:rPr>
+        <w:t>);</w:t>
+      </w:r>
+      <w:proofErr w:type="gramEnd"/>
+    </w:p>
+    <w:p>
+      <w:pPr>
+        <w:spacing w:after="0"/>
+        <w:rPr>
+          <w:lang w:val="fr-FR"/>
+        </w:rPr>
+      </w:pPr>
+      <w:r>
+        <w:rPr>
+          <w:lang w:val="en-CA"/>
+        </w:rPr>
+        <w:tab/>
+      </w:r>
+      <w:r>
+        <w:rPr>
+          <w:lang w:val="fr-FR"/>
+        </w:rPr>
+        <w:t>}</w:t>
+      </w:r>
+    </w:p>
+    <w:p>
+      <w:pPr>
+        <w:spacing w:after="0"/>
+        <w:rPr>
+          <w:lang w:val="fr-FR"/>
+        </w:rPr>
+      </w:pPr>
+      <w:r>
+        <w:rPr>
+          <w:lang w:val="fr-FR"/>
+        </w:rPr>
+        <w:tab/>
+      </w:r>
+    </w:p>
+    <w:p>
+      <w:pPr>
+        <w:spacing w:after="0"/>
+        <w:rPr>
+          <w:lang w:val="fr-FR"/>
+        </w:rPr>
+      </w:pPr>
+      <w:r>
+        <w:rPr>
+          <w:lang w:val="fr-FR"/>
+        </w:rPr>
+        <w:t>}</w:t>
+      </w:r>
+    </w:p>
+    <w:p>
+      <w:pPr>
+        <w:spacing w:after="0"/>
+        <w:rPr>
+          <w:lang w:val="fr-FR"/>
+        </w:rPr>
+      </w:pPr>
+    </w:p>
+    <w:p>
+      <w:pPr>
+        <w:spacing w:after="0"/>
+        <w:rPr>
+          <w:lang w:val="fr-FR"/>
+        </w:rPr>
+      </w:pPr>
+      <w:proofErr w:type="gramStart"/>
+      <w:r>
+        <w:rPr>
+          <w:lang w:val="fr-FR"/>
+        </w:rPr>
+        <w:t>public</w:t>
+      </w:r>
+      <w:proofErr w:type="gramEnd"/>
+      <w:r>
+        <w:rPr>
+          <w:lang w:val="fr-FR"/>
+        </w:rPr>
+        <w:t xml:space="preserve"> </w:t>
+      </w:r>
+      <w:proofErr w:type="spellStart"/>
+      <w:r>
+        <w:rPr>
+          <w:lang w:val="fr-FR"/>
+        </w:rPr>
+        <w:t>void</w:t>
+      </w:r>
+      <w:proofErr w:type="spellEnd"/>
+      <w:r>
+        <w:rPr>
+          <w:lang w:val="fr-FR"/>
+        </w:rPr>
+        <w:t xml:space="preserve"> </w:t>
+      </w:r>
+      <w:proofErr w:type="spellStart"/>
+      <w:r>
+        <w:rPr>
+          <w:lang w:val="fr-FR"/>
+        </w:rPr>
+        <w:t>nePasLancerException</w:t>
+      </w:r>
+      <w:proofErr w:type="spellEnd"/>
+      <w:r>
+        <w:rPr>
+          <w:lang w:val="fr-FR"/>
+        </w:rPr>
+        <w:t xml:space="preserve"> </w:t>
+      </w:r>
+      <w:proofErr w:type="gramStart"/>
+      <w:r>
+        <w:rPr>
+          <w:lang w:val="fr-FR"/>
+        </w:rPr>
+        <w:t>(){</w:t>
+      </w:r>
+      <w:proofErr w:type="gramEnd"/>
+    </w:p>
+    <w:p>
+      <w:pPr>
+        <w:spacing w:after="0"/>
+        <w:rPr>
+          <w:lang w:val="fr-FR"/>
+        </w:rPr>
+      </w:pPr>
+      <w:r>
+        <w:rPr>
+          <w:lang w:val="fr-FR"/>
+        </w:rPr>
+        <w:tab/>
+      </w:r>
+    </w:p>
+    <w:p>
+      <w:pPr>
+        <w:spacing w:after="0"/>
+        <w:rPr>
+          <w:lang w:val="fr-FR"/>
+        </w:rPr>
+      </w:pPr>
+      <w:r>
+        <w:rPr>
+          <w:lang w:val="fr-FR"/>
+        </w:rPr>
+        <w:tab/>
+      </w:r>
+      <w:proofErr w:type="spellStart"/>
+      <w:proofErr w:type="gramStart"/>
+      <w:r>
+        <w:rPr>
+          <w:lang w:val="fr-FR"/>
+        </w:rPr>
+        <w:t>try</w:t>
+      </w:r>
+      <w:proofErr w:type="spellEnd"/>
+      <w:r>
+        <w:rPr>
+          <w:lang w:val="fr-FR"/>
+        </w:rPr>
+        <w:t>{</w:t>
+      </w:r>
+      <w:proofErr w:type="gramEnd"/>
+    </w:p>
+    <w:p>
+      <w:pPr>
+        <w:spacing w:after="0"/>
+        <w:rPr>
+          <w:lang w:val="fr-FR"/>
+        </w:rPr>
+      </w:pPr>
+      <w:r>
+        <w:rPr>
+          <w:lang w:val="fr-FR"/>
+        </w:rPr>
+        <w:tab/>
+      </w:r>
+      <w:r>
+        <w:rPr>
+          <w:lang w:val="fr-FR"/>
+        </w:rPr>
+        <w:tab/>
+      </w:r>
+      <w:proofErr w:type="spellStart"/>
+      <w:r>
+        <w:rPr>
+          <w:lang w:val="fr-FR"/>
+        </w:rPr>
+        <w:t>System.out.println</w:t>
+      </w:r>
+      <w:proofErr w:type="spellEnd"/>
+      <w:r>
+        <w:rPr>
+          <w:lang w:val="fr-FR"/>
+        </w:rPr>
+        <w:t xml:space="preserve"> ("</w:t>
+      </w:r>
+      <w:proofErr w:type="gramStart"/>
+      <w:r>
+        <w:rPr>
+          <w:lang w:val="fr-FR"/>
+        </w:rPr>
+        <w:t>6.Méthode</w:t>
+      </w:r>
+      <w:proofErr w:type="gramEnd"/>
+      <w:r>
+        <w:rPr>
+          <w:lang w:val="fr-FR"/>
+        </w:rPr>
+        <w:t xml:space="preserve"> ne pas </w:t>
+      </w:r>
+      <w:proofErr w:type="spellStart"/>
+      <w:r>
+        <w:rPr>
+          <w:lang w:val="fr-FR"/>
+        </w:rPr>
+        <w:t>lancerException</w:t>
+      </w:r>
+      <w:proofErr w:type="spellEnd"/>
+      <w:r>
+        <w:rPr>
+          <w:lang w:val="fr-FR"/>
+        </w:rPr>
+        <w:t>"</w:t>
+      </w:r>
+      <w:proofErr w:type="gramStart"/>
+      <w:r>
+        <w:rPr>
+          <w:lang w:val="fr-FR"/>
+        </w:rPr>
+        <w:t>);</w:t>
+      </w:r>
+      <w:proofErr w:type="gramEnd"/>
+    </w:p>
+    <w:p>
+      <w:pPr>
+        <w:spacing w:after="0"/>
+        <w:rPr>
+          <w:lang w:val="en-CA"/>
+        </w:rPr>
+      </w:pPr>
+      <w:r>
+        <w:rPr>
+          <w:lang w:val="fr-FR"/>
+        </w:rPr>
+        <w:tab/>
+      </w:r>
+      <w:r>
+        <w:rPr>
+          <w:lang w:val="en-CA"/>
+        </w:rPr>
+        <w:t>}</w:t>
+      </w:r>
+    </w:p>
+    <w:p>
+      <w:pPr>
+        <w:spacing w:after="0"/>
+        <w:rPr>
+          <w:lang w:val="en-CA"/>
+        </w:rPr>
+      </w:pPr>
+      <w:r>
+        <w:rPr>
+          <w:lang w:val="en-CA"/>
+        </w:rPr>
+        <w:tab/>
+      </w:r>
+      <w:proofErr w:type="gramStart"/>
+      <w:r>
+        <w:rPr>
+          <w:lang w:val="en-CA"/>
+        </w:rPr>
+        <w:t>catch(</w:t>
+      </w:r>
+      <w:proofErr w:type="gramEnd"/>
+      <w:r>
+        <w:rPr>
+          <w:lang w:val="en-CA"/>
+        </w:rPr>
+        <w:t xml:space="preserve">Exception </w:t>
+      </w:r>
+      <w:proofErr w:type="spellStart"/>
+      <w:proofErr w:type="gramStart"/>
+      <w:r>
+        <w:rPr>
+          <w:lang w:val="en-CA"/>
+        </w:rPr>
+        <w:t>exception</w:t>
+      </w:r>
+      <w:proofErr w:type="spellEnd"/>
+      <w:r>
+        <w:rPr>
+          <w:lang w:val="en-CA"/>
+        </w:rPr>
+        <w:t xml:space="preserve"> )</w:t>
+      </w:r>
+      <w:proofErr w:type="gramEnd"/>
+      <w:r>
+        <w:rPr>
+          <w:lang w:val="en-CA"/>
+        </w:rPr>
+        <w:t>{</w:t>
+      </w:r>
+    </w:p>
+    <w:p>
+      <w:pPr>
+        <w:spacing w:after="0"/>
+        <w:rPr>
+          <w:lang w:val="fr-FR"/>
+        </w:rPr>
+      </w:pPr>
+      <w:r>
+        <w:rPr>
+          <w:lang w:val="en-CA"/>
+        </w:rPr>
+        <w:tab/>
+      </w:r>
+      <w:r>
+        <w:rPr>
+          <w:lang w:val="en-CA"/>
+        </w:rPr>
+        <w:tab/>
+      </w:r>
+      <w:proofErr w:type="spellStart"/>
+      <w:r>
+        <w:rPr>
+          <w:lang w:val="en-CA"/>
+        </w:rPr>
+        <w:t>System.out.println</w:t>
+      </w:r>
+      <w:proofErr w:type="spellEnd"/>
+      <w:r>
+        <w:rPr>
+          <w:lang w:val="en-CA"/>
+        </w:rPr>
+        <w:t xml:space="preserve"> ("7. </w:t>
+      </w:r>
+      <w:r>
+        <w:rPr>
+          <w:lang w:val="fr-FR"/>
+        </w:rPr>
+        <w:t xml:space="preserve">Exception dans </w:t>
+      </w:r>
+      <w:proofErr w:type="spellStart"/>
+      <w:r>
+        <w:rPr>
+          <w:lang w:val="fr-FR"/>
+        </w:rPr>
+        <w:t>nePasLancerException</w:t>
+      </w:r>
+      <w:proofErr w:type="spellEnd"/>
+      <w:r>
+        <w:rPr>
+          <w:lang w:val="fr-FR"/>
+        </w:rPr>
+        <w:t>"</w:t>
+      </w:r>
+      <w:proofErr w:type="gramStart"/>
+      <w:r>
+        <w:rPr>
+          <w:lang w:val="fr-FR"/>
+        </w:rPr>
+        <w:t>);</w:t>
+      </w:r>
+      <w:proofErr w:type="gramEnd"/>
+    </w:p>
+    <w:p>
+      <w:pPr>
+        <w:spacing w:after="0"/>
+        <w:rPr>
+          <w:lang w:val="fr-FR"/>
+        </w:rPr>
+      </w:pPr>
+      <w:r>
+        <w:rPr>
+          <w:lang w:val="fr-FR"/>
+        </w:rPr>
+        <w:tab/>
+        <w:t>}</w:t>
+      </w:r>
+    </w:p>
+    <w:p>
+      <w:pPr>
+        <w:spacing w:after="0"/>
+        <w:rPr>
+          <w:lang w:val="fr-FR"/>
+        </w:rPr>
+      </w:pPr>
+      <w:r>
+        <w:rPr>
+          <w:lang w:val="fr-FR"/>
+        </w:rPr>
+        <w:tab/>
+      </w:r>
+      <w:proofErr w:type="spellStart"/>
+      <w:proofErr w:type="gramStart"/>
+      <w:r>
+        <w:rPr>
+          <w:lang w:val="fr-FR"/>
+        </w:rPr>
+        <w:t>finally</w:t>
+      </w:r>
+      <w:proofErr w:type="spellEnd"/>
+      <w:r>
+        <w:rPr>
+          <w:lang w:val="fr-FR"/>
+        </w:rPr>
+        <w:t>{</w:t>
+      </w:r>
+      <w:proofErr w:type="gramEnd"/>
+    </w:p>
+    <w:p>
+      <w:pPr>
+        <w:spacing w:after="0"/>
       </w:pPr>
       <w:r>
         <w:rPr>
@@ -1342,8 +1797,29 @@
         </w:rPr>
         <w:tab/>
       </w:r>
-      <w:r>
-        <w:t>System.out.println ("8. Finally dans nePasLancerException");</w:t>
+      <w:proofErr w:type="spellStart"/>
+      <w:r>
+        <w:t>System.out.println</w:t>
+      </w:r>
+      <w:proofErr w:type="spellEnd"/>
+      <w:r>
+        <w:t xml:space="preserve"> ("8. </w:t>
+      </w:r>
+      <w:proofErr w:type="spellStart"/>
+      <w:r>
+        <w:t>Finally</w:t>
+      </w:r>
+      <w:proofErr w:type="spellEnd"/>
+      <w:r>
+        <w:t xml:space="preserve"> dans </w:t>
+      </w:r>
+      <w:proofErr w:type="spellStart"/>
+      <w:r>
+        <w:t>nePasLancerException</w:t>
+      </w:r>
+      <w:proofErr w:type="spellEnd"/>
+      <w:r>
+        <w:t>");</w:t>
       </w:r>
     </w:p>
     <w:p>
@@ -1365,12 +1841,28 @@
       <w:r>
         <w:tab/>
       </w:r>
+      <w:proofErr w:type="spellStart"/>
       <w:r>
         <w:rPr>
           <w:lang w:val="fr-FR"/>
         </w:rPr>
-        <w:t>System.out.println ("9. Fin de la méthode nePasLancerException</w:t>
-      </w:r>
+        <w:t>System.out.println</w:t>
+      </w:r>
+      <w:proofErr w:type="spellEnd"/>
+      <w:r>
+        <w:rPr>
+          <w:lang w:val="fr-FR"/>
+        </w:rPr>
+        <w:t xml:space="preserve"> ("9. Fin de la méthode </w:t>
+      </w:r>
+      <w:proofErr w:type="spellStart"/>
+      <w:r>
+        <w:rPr>
+          <w:lang w:val="fr-FR"/>
+        </w:rPr>
+        <w:t>nePasLancerException</w:t>
+      </w:r>
+      <w:proofErr w:type="spellEnd"/>
       <w:proofErr w:type="gramStart"/>
       <w:r>
         <w:rPr>
@@ -1453,7 +1945,7 @@
 </file>
 
 <file path=word/endnotes.xml><?xml version="1.0" encoding="utf-8"?>
-<w:endnotes xmlns:wpc="http://schemas.microsoft.com/office/word/2010/wordprocessingCanvas" xmlns:cx="http://schemas.microsoft.com/office/drawing/2014/chartex" xmlns:cx1="http://schemas.microsoft.com/office/drawing/2015/9/8/chartex" xmlns:cx2="http://schemas.microsoft.com/office/drawing/2015/10/21/chartex" xmlns:cx3="http://schemas.microsoft.com/office/drawing/2016/5/9/chartex" xmlns:cx4="http://schemas.microsoft.com/office/drawing/2016/5/10/chartex" xmlns:cx5="http://schemas.microsoft.com/office/drawing/2016/5/11/chartex" xmlns:cx6="http://schemas.microsoft.com/office/drawing/2016/5/12/chartex" xmlns:cx7="http://schemas.microsoft.com/office/drawing/2016/5/13/chartex" xmlns:cx8="http://schemas.microsoft.com/office/drawing/2016/5/14/chartex" xmlns:mc="http://schemas.openxmlformats.org/markup-compatibility/2006" xmlns:aink="http://schemas.microsoft.com/office/drawing/2016/ink" xmlns:am3d="http://schemas.microsoft.com/office/drawing/2017/model3d" xmlns:o="urn:schemas-microsoft-com:office:office" xmlns:oel="http://schemas.microsoft.com/office/2019/extlst" xmlns:r="http://schemas.openxmlformats.org/officeDocument/2006/relationships" xmlns:m="http://schemas.openxmlformats.org/officeDocument/2006/math" xmlns:v="urn:schemas-microsoft-com:vml" xmlns:wp14="http://schemas.microsoft.com/office/word/2010/wordprocessingDrawing" xmlns:wp="http://schemas.openxmlformats.org/drawingml/2006/wordprocessingDrawing" xmlns:w10="urn:schemas-microsoft-com:office:word" xmlns:w="http://schemas.openxmlformats.org/wordprocessingml/2006/main" xmlns:w14="http://schemas.microsoft.com/office/word/2010/wordml" xmlns:w15="http://schemas.microsoft.com/office/word/2012/wordml" xmlns:w16cex="http://schemas.microsoft.com/office/word/2018/wordml/cex" xmlns:w16cid="http://schemas.microsoft.com/office/word/2016/wordml/cid" xmlns:w16="http://schemas.microsoft.com/office/word/2018/wordml" xmlns:w16sdtdh="http://schemas.microsoft.com/office/word/2020/wordml/sdtdatahash" xmlns:w16se="http://schemas.microsoft.com/office/word/2015/wordml/symex" xmlns:wpg="http://schemas.microsoft.com/office/word/2010/wordprocessingGroup" xmlns:wpi="http://schemas.microsoft.com/office/word/2010/wordprocessingInk" xmlns:wne="http://schemas.microsoft.com/office/word/2006/wordml" xmlns:wps="http://schemas.microsoft.com/office/word/2010/wordprocessingShape" mc:Ignorable="w14 w15 w16se w16cid w16 w16cex w16sdtdh wp14">
+<w:endnotes xmlns:wpc="http://schemas.microsoft.com/office/word/2010/wordprocessingCanvas" xmlns:cx="http://schemas.microsoft.com/office/drawing/2014/chartex" xmlns:cx1="http://schemas.microsoft.com/office/drawing/2015/9/8/chartex" xmlns:cx2="http://schemas.microsoft.com/office/drawing/2015/10/21/chartex" xmlns:cx3="http://schemas.microsoft.com/office/drawing/2016/5/9/chartex" xmlns:cx4="http://schemas.microsoft.com/office/drawing/2016/5/10/chartex" xmlns:cx5="http://schemas.microsoft.com/office/drawing/2016/5/11/chartex" xmlns:cx6="http://schemas.microsoft.com/office/drawing/2016/5/12/chartex" xmlns:cx7="http://schemas.microsoft.com/office/drawing/2016/5/13/chartex" xmlns:cx8="http://schemas.microsoft.com/office/drawing/2016/5/14/chartex" xmlns:mc="http://schemas.openxmlformats.org/markup-compatibility/2006" xmlns:aink="http://schemas.microsoft.com/office/drawing/2016/ink" xmlns:am3d="http://schemas.microsoft.com/office/drawing/2017/model3d" xmlns:o="urn:schemas-microsoft-com:office:office" xmlns:oel="http://schemas.microsoft.com/office/2019/extlst" xmlns:r="http://schemas.openxmlformats.org/officeDocument/2006/relationships" xmlns:m="http://schemas.openxmlformats.org/officeDocument/2006/math" xmlns:v="urn:schemas-microsoft-com:vml" xmlns:wp14="http://schemas.microsoft.com/office/word/2010/wordprocessingDrawing" xmlns:wp="http://schemas.openxmlformats.org/drawingml/2006/wordprocessingDrawing" xmlns:w10="urn:schemas-microsoft-com:office:word" xmlns:w="http://schemas.openxmlformats.org/wordprocessingml/2006/main" xmlns:w14="http://schemas.microsoft.com/office/word/2010/wordml" xmlns:w15="http://schemas.microsoft.com/office/word/2012/wordml" xmlns:w16cex="http://schemas.microsoft.com/office/word/2018/wordml/cex" xmlns:w16cid="http://schemas.microsoft.com/office/word/2016/wordml/cid" xmlns:w16="http://schemas.microsoft.com/office/word/2018/wordml" xmlns:w16du="http://schemas.microsoft.com/office/word/2023/wordml/word16du" xmlns:w16sdtdh="http://schemas.microsoft.com/office/word/2020/wordml/sdtdatahash" xmlns:w16sdtfl="http://schemas.microsoft.com/office/word/2024/wordml/sdtformatlock" xmlns:w16se="http://schemas.microsoft.com/office/word/2015/wordml/symex" xmlns:wpg="http://schemas.microsoft.com/office/word/2010/wordprocessingGroup" xmlns:wpi="http://schemas.microsoft.com/office/word/2010/wordprocessingInk" xmlns:wne="http://schemas.microsoft.com/office/word/2006/wordml" xmlns:wps="http://schemas.microsoft.com/office/word/2010/wordprocessingShape" mc:Ignorable="w14 w15 w16se w16cid w16 w16cex w16sdtdh w16sdtfl w16du wp14">
   <w:endnote w:type="separator" w:id="-1">
     <w:p>
       <w:pPr>
@@ -1478,7 +1970,7 @@
 </file>
 
 <file path=word/footer1.xml><?xml version="1.0" encoding="utf-8"?>
-<w:ftr xmlns:wpc="http://schemas.microsoft.com/office/word/2010/wordprocessingCanvas" xmlns:cx="http://schemas.microsoft.com/office/drawing/2014/chartex" xmlns:cx1="http://schemas.microsoft.com/office/drawing/2015/9/8/chartex" xmlns:cx2="http://schemas.microsoft.com/office/drawing/2015/10/21/chartex" xmlns:cx3="http://schemas.microsoft.com/office/drawing/2016/5/9/chartex" xmlns:cx4="http://schemas.microsoft.com/office/drawing/2016/5/10/chartex" xmlns:cx5="http://schemas.microsoft.com/office/drawing/2016/5/11/chartex" xmlns:cx6="http://schemas.microsoft.com/office/drawing/2016/5/12/chartex" xmlns:cx7="http://schemas.microsoft.com/office/drawing/2016/5/13/chartex" xmlns:cx8="http://schemas.microsoft.com/office/drawing/2016/5/14/chartex" xmlns:mc="http://schemas.openxmlformats.org/markup-compatibility/2006" xmlns:aink="http://schemas.microsoft.com/office/drawing/2016/ink" xmlns:am3d="http://schemas.microsoft.com/office/drawing/2017/model3d" xmlns:o="urn:schemas-microsoft-com:office:office" xmlns:oel="http://schemas.microsoft.com/office/2019/extlst" xmlns:r="http://schemas.openxmlformats.org/officeDocument/2006/relationships" xmlns:m="http://schemas.openxmlformats.org/officeDocument/2006/math" xmlns:v="urn:schemas-microsoft-com:vml" xmlns:wp14="http://schemas.microsoft.com/office/word/2010/wordprocessingDrawing" xmlns:wp="http://schemas.openxmlformats.org/drawingml/2006/wordprocessingDrawing" xmlns:w10="urn:schemas-microsoft-com:office:word" xmlns:w="http://schemas.openxmlformats.org/wordprocessingml/2006/main" xmlns:w14="http://schemas.microsoft.com/office/word/2010/wordml" xmlns:w15="http://schemas.microsoft.com/office/word/2012/wordml" xmlns:w16cex="http://schemas.microsoft.com/office/word/2018/wordml/cex" xmlns:w16cid="http://schemas.microsoft.com/office/word/2016/wordml/cid" xmlns:w16="http://schemas.microsoft.com/office/word/2018/wordml" xmlns:w16sdtdh="http://schemas.microsoft.com/office/word/2020/wordml/sdtdatahash" xmlns:w16se="http://schemas.microsoft.com/office/word/2015/wordml/symex" xmlns:wpg="http://schemas.microsoft.com/office/word/2010/wordprocessingGroup" xmlns:wpi="http://schemas.microsoft.com/office/word/2010/wordprocessingInk" xmlns:wne="http://schemas.microsoft.com/office/word/2006/wordml" xmlns:wps="http://schemas.microsoft.com/office/word/2010/wordprocessingShape" mc:Ignorable="w14 w15 w16se w16cid w16 w16cex w16sdtdh wp14">
+<w:ftr xmlns:wpc="http://schemas.microsoft.com/office/word/2010/wordprocessingCanvas" xmlns:cx="http://schemas.microsoft.com/office/drawing/2014/chartex" xmlns:cx1="http://schemas.microsoft.com/office/drawing/2015/9/8/chartex" xmlns:cx2="http://schemas.microsoft.com/office/drawing/2015/10/21/chartex" xmlns:cx3="http://schemas.microsoft.com/office/drawing/2016/5/9/chartex" xmlns:cx4="http://schemas.microsoft.com/office/drawing/2016/5/10/chartex" xmlns:cx5="http://schemas.microsoft.com/office/drawing/2016/5/11/chartex" xmlns:cx6="http://schemas.microsoft.com/office/drawing/2016/5/12/chartex" xmlns:cx7="http://schemas.microsoft.com/office/drawing/2016/5/13/chartex" xmlns:cx8="http://schemas.microsoft.com/office/drawing/2016/5/14/chartex" xmlns:mc="http://schemas.openxmlformats.org/markup-compatibility/2006" xmlns:aink="http://schemas.microsoft.com/office/drawing/2016/ink" xmlns:am3d="http://schemas.microsoft.com/office/drawing/2017/model3d" xmlns:o="urn:schemas-microsoft-com:office:office" xmlns:oel="http://schemas.microsoft.com/office/2019/extlst" xmlns:r="http://schemas.openxmlformats.org/officeDocument/2006/relationships" xmlns:m="http://schemas.openxmlformats.org/officeDocument/2006/math" xmlns:v="urn:schemas-microsoft-com:vml" xmlns:wp14="http://schemas.microsoft.com/office/word/2010/wordprocessingDrawing" xmlns:wp="http://schemas.openxmlformats.org/drawingml/2006/wordprocessingDrawing" xmlns:w10="urn:schemas-microsoft-com:office:word" xmlns:w="http://schemas.openxmlformats.org/wordprocessingml/2006/main" xmlns:w14="http://schemas.microsoft.com/office/word/2010/wordml" xmlns:w15="http://schemas.microsoft.com/office/word/2012/wordml" xmlns:w16cex="http://schemas.microsoft.com/office/word/2018/wordml/cex" xmlns:w16cid="http://schemas.microsoft.com/office/word/2016/wordml/cid" xmlns:w16="http://schemas.microsoft.com/office/word/2018/wordml" xmlns:w16du="http://schemas.microsoft.com/office/word/2023/wordml/word16du" xmlns:w16sdtdh="http://schemas.microsoft.com/office/word/2020/wordml/sdtdatahash" xmlns:w16sdtfl="http://schemas.microsoft.com/office/word/2024/wordml/sdtformatlock" xmlns:w16se="http://schemas.microsoft.com/office/word/2015/wordml/symex" xmlns:wpg="http://schemas.microsoft.com/office/word/2010/wordprocessingGroup" xmlns:wpi="http://schemas.microsoft.com/office/word/2010/wordprocessingInk" xmlns:wne="http://schemas.microsoft.com/office/word/2006/wordml" xmlns:wps="http://schemas.microsoft.com/office/word/2010/wordprocessingShape" mc:Ignorable="w14 w15 w16se w16cid w16 w16cex w16sdtdh w16sdtfl w16du wp14">
   <w:p>
     <w:pPr>
       <w:pStyle w:val="Pieddepage"/>
@@ -1488,7 +1980,7 @@
 </file>
 
 <file path=word/footer2.xml><?xml version="1.0" encoding="utf-8"?>
-<w:ftr xmlns:wpc="http://schemas.microsoft.com/office/word/2010/wordprocessingCanvas" xmlns:cx="http://schemas.microsoft.com/office/drawing/2014/chartex" xmlns:cx1="http://schemas.microsoft.com/office/drawing/2015/9/8/chartex" xmlns:cx2="http://schemas.microsoft.com/office/drawing/2015/10/21/chartex" xmlns:cx3="http://schemas.microsoft.com/office/drawing/2016/5/9/chartex" xmlns:cx4="http://schemas.microsoft.com/office/drawing/2016/5/10/chartex" xmlns:cx5="http://schemas.microsoft.com/office/drawing/2016/5/11/chartex" xmlns:cx6="http://schemas.microsoft.com/office/drawing/2016/5/12/chartex" xmlns:cx7="http://schemas.microsoft.com/office/drawing/2016/5/13/chartex" xmlns:cx8="http://schemas.microsoft.com/office/drawing/2016/5/14/chartex" xmlns:mc="http://schemas.openxmlformats.org/markup-compatibility/2006" xmlns:aink="http://schemas.microsoft.com/office/drawing/2016/ink" xmlns:am3d="http://schemas.microsoft.com/office/drawing/2017/model3d" xmlns:o="urn:schemas-microsoft-com:office:office" xmlns:oel="http://schemas.microsoft.com/office/2019/extlst" xmlns:r="http://schemas.openxmlformats.org/officeDocument/2006/relationships" xmlns:m="http://schemas.openxmlformats.org/officeDocument/2006/math" xmlns:v="urn:schemas-microsoft-com:vml" xmlns:wp14="http://schemas.microsoft.com/office/word/2010/wordprocessingDrawing" xmlns:wp="http://schemas.openxmlformats.org/drawingml/2006/wordprocessingDrawing" xmlns:w10="urn:schemas-microsoft-com:office:word" xmlns:w="http://schemas.openxmlformats.org/wordprocessingml/2006/main" xmlns:w14="http://schemas.microsoft.com/office/word/2010/wordml" xmlns:w15="http://schemas.microsoft.com/office/word/2012/wordml" xmlns:w16cex="http://schemas.microsoft.com/office/word/2018/wordml/cex" xmlns:w16cid="http://schemas.microsoft.com/office/word/2016/wordml/cid" xmlns:w16="http://schemas.microsoft.com/office/word/2018/wordml" xmlns:w16sdtdh="http://schemas.microsoft.com/office/word/2020/wordml/sdtdatahash" xmlns:w16se="http://schemas.microsoft.com/office/word/2015/wordml/symex" xmlns:wpg="http://schemas.microsoft.com/office/word/2010/wordprocessingGroup" xmlns:wpi="http://schemas.microsoft.com/office/word/2010/wordprocessingInk" xmlns:wne="http://schemas.microsoft.com/office/word/2006/wordml" xmlns:wps="http://schemas.microsoft.com/office/word/2010/wordprocessingShape" mc:Ignorable="w14 w15 w16se w16cid w16 w16cex w16sdtdh wp14">
+<w:ftr xmlns:wpc="http://schemas.microsoft.com/office/word/2010/wordprocessingCanvas" xmlns:cx="http://schemas.microsoft.com/office/drawing/2014/chartex" xmlns:cx1="http://schemas.microsoft.com/office/drawing/2015/9/8/chartex" xmlns:cx2="http://schemas.microsoft.com/office/drawing/2015/10/21/chartex" xmlns:cx3="http://schemas.microsoft.com/office/drawing/2016/5/9/chartex" xmlns:cx4="http://schemas.microsoft.com/office/drawing/2016/5/10/chartex" xmlns:cx5="http://schemas.microsoft.com/office/drawing/2016/5/11/chartex" xmlns:cx6="http://schemas.microsoft.com/office/drawing/2016/5/12/chartex" xmlns:cx7="http://schemas.microsoft.com/office/drawing/2016/5/13/chartex" xmlns:cx8="http://schemas.microsoft.com/office/drawing/2016/5/14/chartex" xmlns:mc="http://schemas.openxmlformats.org/markup-compatibility/2006" xmlns:aink="http://schemas.microsoft.com/office/drawing/2016/ink" xmlns:am3d="http://schemas.microsoft.com/office/drawing/2017/model3d" xmlns:o="urn:schemas-microsoft-com:office:office" xmlns:oel="http://schemas.microsoft.com/office/2019/extlst" xmlns:r="http://schemas.openxmlformats.org/officeDocument/2006/relationships" xmlns:m="http://schemas.openxmlformats.org/officeDocument/2006/math" xmlns:v="urn:schemas-microsoft-com:vml" xmlns:wp14="http://schemas.microsoft.com/office/word/2010/wordprocessingDrawing" xmlns:wp="http://schemas.openxmlformats.org/drawingml/2006/wordprocessingDrawing" xmlns:w10="urn:schemas-microsoft-com:office:word" xmlns:w="http://schemas.openxmlformats.org/wordprocessingml/2006/main" xmlns:w14="http://schemas.microsoft.com/office/word/2010/wordml" xmlns:w15="http://schemas.microsoft.com/office/word/2012/wordml" xmlns:w16cex="http://schemas.microsoft.com/office/word/2018/wordml/cex" xmlns:w16cid="http://schemas.microsoft.com/office/word/2016/wordml/cid" xmlns:w16="http://schemas.microsoft.com/office/word/2018/wordml" xmlns:w16du="http://schemas.microsoft.com/office/word/2023/wordml/word16du" xmlns:w16sdtdh="http://schemas.microsoft.com/office/word/2020/wordml/sdtdatahash" xmlns:w16sdtfl="http://schemas.microsoft.com/office/word/2024/wordml/sdtformatlock" xmlns:w16se="http://schemas.microsoft.com/office/word/2015/wordml/symex" xmlns:wpg="http://schemas.microsoft.com/office/word/2010/wordprocessingGroup" xmlns:wpi="http://schemas.microsoft.com/office/word/2010/wordprocessingInk" xmlns:wne="http://schemas.microsoft.com/office/word/2006/wordml" xmlns:wps="http://schemas.microsoft.com/office/word/2010/wordprocessingShape" mc:Ignorable="w14 w15 w16se w16cid w16 w16cex w16sdtdh w16sdtfl w16du wp14">
   <w:sdt>
     <w:sdtPr>
       <w:id w:val="591049890"/>
@@ -1738,7 +2230,23 @@
             <w:i/>
             <w:color w:val="C00000"/>
           </w:rPr>
-          <w:t xml:space="preserve"> Éric Labonté, Cégep du Vieux Montréal</w:t>
+          <w:t xml:space="preserve"> Éric </w:t>
+        </w:r>
+        <w:proofErr w:type="spellStart"/>
+        <w:r>
+          <w:rPr>
+            <w:i/>
+            <w:color w:val="C00000"/>
+          </w:rPr>
+          <w:t>Labonté</w:t>
+        </w:r>
+        <w:proofErr w:type="spellEnd"/>
+        <w:r>
+          <w:rPr>
+            <w:i/>
+            <w:color w:val="C00000"/>
+          </w:rPr>
+          <w:t>, Cégep du Vieux Montréal</w:t>
         </w:r>
       </w:p>
     </w:sdtContent>
@@ -1747,7 +2255,7 @@
 </file>
 
 <file path=word/footer3.xml><?xml version="1.0" encoding="utf-8"?>
-<w:ftr xmlns:wpc="http://schemas.microsoft.com/office/word/2010/wordprocessingCanvas" xmlns:cx="http://schemas.microsoft.com/office/drawing/2014/chartex" xmlns:cx1="http://schemas.microsoft.com/office/drawing/2015/9/8/chartex" xmlns:cx2="http://schemas.microsoft.com/office/drawing/2015/10/21/chartex" xmlns:cx3="http://schemas.microsoft.com/office/drawing/2016/5/9/chartex" xmlns:cx4="http://schemas.microsoft.com/office/drawing/2016/5/10/chartex" xmlns:cx5="http://schemas.microsoft.com/office/drawing/2016/5/11/chartex" xmlns:cx6="http://schemas.microsoft.com/office/drawing/2016/5/12/chartex" xmlns:cx7="http://schemas.microsoft.com/office/drawing/2016/5/13/chartex" xmlns:cx8="http://schemas.microsoft.com/office/drawing/2016/5/14/chartex" xmlns:mc="http://schemas.openxmlformats.org/markup-compatibility/2006" xmlns:aink="http://schemas.microsoft.com/office/drawing/2016/ink" xmlns:am3d="http://schemas.microsoft.com/office/drawing/2017/model3d" xmlns:o="urn:schemas-microsoft-com:office:office" xmlns:oel="http://schemas.microsoft.com/office/2019/extlst" xmlns:r="http://schemas.openxmlformats.org/officeDocument/2006/relationships" xmlns:m="http://schemas.openxmlformats.org/officeDocument/2006/math" xmlns:v="urn:schemas-microsoft-com:vml" xmlns:wp14="http://schemas.microsoft.com/office/word/2010/wordprocessingDrawing" xmlns:wp="http://schemas.openxmlformats.org/drawingml/2006/wordprocessingDrawing" xmlns:w10="urn:schemas-microsoft-com:office:word" xmlns:w="http://schemas.openxmlformats.org/wordprocessingml/2006/main" xmlns:w14="http://schemas.microsoft.com/office/word/2010/wordml" xmlns:w15="http://schemas.microsoft.com/office/word/2012/wordml" xmlns:w16cex="http://schemas.microsoft.com/office/word/2018/wordml/cex" xmlns:w16cid="http://schemas.microsoft.com/office/word/2016/wordml/cid" xmlns:w16="http://schemas.microsoft.com/office/word/2018/wordml" xmlns:w16sdtdh="http://schemas.microsoft.com/office/word/2020/wordml/sdtdatahash" xmlns:w16se="http://schemas.microsoft.com/office/word/2015/wordml/symex" xmlns:wpg="http://schemas.microsoft.com/office/word/2010/wordprocessingGroup" xmlns:wpi="http://schemas.microsoft.com/office/word/2010/wordprocessingInk" xmlns:wne="http://schemas.microsoft.com/office/word/2006/wordml" xmlns:wps="http://schemas.microsoft.com/office/word/2010/wordprocessingShape" mc:Ignorable="w14 w15 w16se w16cid w16 w16cex w16sdtdh wp14">
+<w:ftr xmlns:wpc="http://schemas.microsoft.com/office/word/2010/wordprocessingCanvas" xmlns:cx="http://schemas.microsoft.com/office/drawing/2014/chartex" xmlns:cx1="http://schemas.microsoft.com/office/drawing/2015/9/8/chartex" xmlns:cx2="http://schemas.microsoft.com/office/drawing/2015/10/21/chartex" xmlns:cx3="http://schemas.microsoft.com/office/drawing/2016/5/9/chartex" xmlns:cx4="http://schemas.microsoft.com/office/drawing/2016/5/10/chartex" xmlns:cx5="http://schemas.microsoft.com/office/drawing/2016/5/11/chartex" xmlns:cx6="http://schemas.microsoft.com/office/drawing/2016/5/12/chartex" xmlns:cx7="http://schemas.microsoft.com/office/drawing/2016/5/13/chartex" xmlns:cx8="http://schemas.microsoft.com/office/drawing/2016/5/14/chartex" xmlns:mc="http://schemas.openxmlformats.org/markup-compatibility/2006" xmlns:aink="http://schemas.microsoft.com/office/drawing/2016/ink" xmlns:am3d="http://schemas.microsoft.com/office/drawing/2017/model3d" xmlns:o="urn:schemas-microsoft-com:office:office" xmlns:oel="http://schemas.microsoft.com/office/2019/extlst" xmlns:r="http://schemas.openxmlformats.org/officeDocument/2006/relationships" xmlns:m="http://schemas.openxmlformats.org/officeDocument/2006/math" xmlns:v="urn:schemas-microsoft-com:vml" xmlns:wp14="http://schemas.microsoft.com/office/word/2010/wordprocessingDrawing" xmlns:wp="http://schemas.openxmlformats.org/drawingml/2006/wordprocessingDrawing" xmlns:w10="urn:schemas-microsoft-com:office:word" xmlns:w="http://schemas.openxmlformats.org/wordprocessingml/2006/main" xmlns:w14="http://schemas.microsoft.com/office/word/2010/wordml" xmlns:w15="http://schemas.microsoft.com/office/word/2012/wordml" xmlns:w16cex="http://schemas.microsoft.com/office/word/2018/wordml/cex" xmlns:w16cid="http://schemas.microsoft.com/office/word/2016/wordml/cid" xmlns:w16="http://schemas.microsoft.com/office/word/2018/wordml" xmlns:w16du="http://schemas.microsoft.com/office/word/2023/wordml/word16du" xmlns:w16sdtdh="http://schemas.microsoft.com/office/word/2020/wordml/sdtdatahash" xmlns:w16sdtfl="http://schemas.microsoft.com/office/word/2024/wordml/sdtformatlock" xmlns:w16se="http://schemas.microsoft.com/office/word/2015/wordml/symex" xmlns:wpg="http://schemas.microsoft.com/office/word/2010/wordprocessingGroup" xmlns:wpi="http://schemas.microsoft.com/office/word/2010/wordprocessingInk" xmlns:wne="http://schemas.microsoft.com/office/word/2006/wordml" xmlns:wps="http://schemas.microsoft.com/office/word/2010/wordprocessingShape" mc:Ignorable="w14 w15 w16se w16cid w16 w16cex w16sdtdh w16sdtfl w16du wp14">
   <w:p>
     <w:pPr>
       <w:pStyle w:val="Pieddepage"/>
@@ -1757,7 +2265,7 @@
 </file>
 
 <file path=word/footnotes.xml><?xml version="1.0" encoding="utf-8"?>
-<w:footnotes xmlns:wpc="http://schemas.microsoft.com/office/word/2010/wordprocessingCanvas" xmlns:cx="http://schemas.microsoft.com/office/drawing/2014/chartex" xmlns:cx1="http://schemas.microsoft.com/office/drawing/2015/9/8/chartex" xmlns:cx2="http://schemas.microsoft.com/office/drawing/2015/10/21/chartex" xmlns:cx3="http://schemas.microsoft.com/office/drawing/2016/5/9/chartex" xmlns:cx4="http://schemas.microsoft.com/office/drawing/2016/5/10/chartex" xmlns:cx5="http://schemas.microsoft.com/office/drawing/2016/5/11/chartex" xmlns:cx6="http://schemas.microsoft.com/office/drawing/2016/5/12/chartex" xmlns:cx7="http://schemas.microsoft.com/office/drawing/2016/5/13/chartex" xmlns:cx8="http://schemas.microsoft.com/office/drawing/2016/5/14/chartex" xmlns:mc="http://schemas.openxmlformats.org/markup-compatibility/2006" xmlns:aink="http://schemas.microsoft.com/office/drawing/2016/ink" xmlns:am3d="http://schemas.microsoft.com/office/drawing/2017/model3d" xmlns:o="urn:schemas-microsoft-com:office:office" xmlns:oel="http://schemas.microsoft.com/office/2019/extlst" xmlns:r="http://schemas.openxmlformats.org/officeDocument/2006/relationships" xmlns:m="http://schemas.openxmlformats.org/officeDocument/2006/math" xmlns:v="urn:schemas-microsoft-com:vml" xmlns:wp14="http://schemas.microsoft.com/office/word/2010/wordprocessingDrawing" xmlns:wp="http://schemas.openxmlformats.org/drawingml/2006/wordprocessingDrawing" xmlns:w10="urn:schemas-microsoft-com:office:word" xmlns:w="http://schemas.openxmlformats.org/wordprocessingml/2006/main" xmlns:w14="http://schemas.microsoft.com/office/word/2010/wordml" xmlns:w15="http://schemas.microsoft.com/office/word/2012/wordml" xmlns:w16cex="http://schemas.microsoft.com/office/word/2018/wordml/cex" xmlns:w16cid="http://schemas.microsoft.com/office/word/2016/wordml/cid" xmlns:w16="http://schemas.microsoft.com/office/word/2018/wordml" xmlns:w16sdtdh="http://schemas.microsoft.com/office/word/2020/wordml/sdtdatahash" xmlns:w16se="http://schemas.microsoft.com/office/word/2015/wordml/symex" xmlns:wpg="http://schemas.microsoft.com/office/word/2010/wordprocessingGroup" xmlns:wpi="http://schemas.microsoft.com/office/word/2010/wordprocessingInk" xmlns:wne="http://schemas.microsoft.com/office/word/2006/wordml" xmlns:wps="http://schemas.microsoft.com/office/word/2010/wordprocessingShape" mc:Ignorable="w14 w15 w16se w16cid w16 w16cex w16sdtdh wp14">
+<w:footnotes xmlns:wpc="http://schemas.microsoft.com/office/word/2010/wordprocessingCanvas" xmlns:cx="http://schemas.microsoft.com/office/drawing/2014/chartex" xmlns:cx1="http://schemas.microsoft.com/office/drawing/2015/9/8/chartex" xmlns:cx2="http://schemas.microsoft.com/office/drawing/2015/10/21/chartex" xmlns:cx3="http://schemas.microsoft.com/office/drawing/2016/5/9/chartex" xmlns:cx4="http://schemas.microsoft.com/office/drawing/2016/5/10/chartex" xmlns:cx5="http://schemas.microsoft.com/office/drawing/2016/5/11/chartex" xmlns:cx6="http://schemas.microsoft.com/office/drawing/2016/5/12/chartex" xmlns:cx7="http://schemas.microsoft.com/office/drawing/2016/5/13/chartex" xmlns:cx8="http://schemas.microsoft.com/office/drawing/2016/5/14/chartex" xmlns:mc="http://schemas.openxmlformats.org/markup-compatibility/2006" xmlns:aink="http://schemas.microsoft.com/office/drawing/2016/ink" xmlns:am3d="http://schemas.microsoft.com/office/drawing/2017/model3d" xmlns:o="urn:schemas-microsoft-com:office:office" xmlns:oel="http://schemas.microsoft.com/office/2019/extlst" xmlns:r="http://schemas.openxmlformats.org/officeDocument/2006/relationships" xmlns:m="http://schemas.openxmlformats.org/officeDocument/2006/math" xmlns:v="urn:schemas-microsoft-com:vml" xmlns:wp14="http://schemas.microsoft.com/office/word/2010/wordprocessingDrawing" xmlns:wp="http://schemas.openxmlformats.org/drawingml/2006/wordprocessingDrawing" xmlns:w10="urn:schemas-microsoft-com:office:word" xmlns:w="http://schemas.openxmlformats.org/wordprocessingml/2006/main" xmlns:w14="http://schemas.microsoft.com/office/word/2010/wordml" xmlns:w15="http://schemas.microsoft.com/office/word/2012/wordml" xmlns:w16cex="http://schemas.microsoft.com/office/word/2018/wordml/cex" xmlns:w16cid="http://schemas.microsoft.com/office/word/2016/wordml/cid" xmlns:w16="http://schemas.microsoft.com/office/word/2018/wordml" xmlns:w16du="http://schemas.microsoft.com/office/word/2023/wordml/word16du" xmlns:w16sdtdh="http://schemas.microsoft.com/office/word/2020/wordml/sdtdatahash" xmlns:w16sdtfl="http://schemas.microsoft.com/office/word/2024/wordml/sdtformatlock" xmlns:w16se="http://schemas.microsoft.com/office/word/2015/wordml/symex" xmlns:wpg="http://schemas.microsoft.com/office/word/2010/wordprocessingGroup" xmlns:wpi="http://schemas.microsoft.com/office/word/2010/wordprocessingInk" xmlns:wne="http://schemas.microsoft.com/office/word/2006/wordml" xmlns:wps="http://schemas.microsoft.com/office/word/2010/wordprocessingShape" mc:Ignorable="w14 w15 w16se w16cid w16 w16cex w16sdtdh w16sdtfl w16du wp14">
   <w:footnote w:type="separator" w:id="-1">
     <w:p>
       <w:pPr>
@@ -1782,7 +2290,7 @@
 </file>
 
 <file path=word/header1.xml><?xml version="1.0" encoding="utf-8"?>
-<w:hdr xmlns:wpc="http://schemas.microsoft.com/office/word/2010/wordprocessingCanvas" xmlns:cx="http://schemas.microsoft.com/office/drawing/2014/chartex" xmlns:cx1="http://schemas.microsoft.com/office/drawing/2015/9/8/chartex" xmlns:cx2="http://schemas.microsoft.com/office/drawing/2015/10/21/chartex" xmlns:cx3="http://schemas.microsoft.com/office/drawing/2016/5/9/chartex" xmlns:cx4="http://schemas.microsoft.com/office/drawing/2016/5/10/chartex" xmlns:cx5="http://schemas.microsoft.com/office/drawing/2016/5/11/chartex" xmlns:cx6="http://schemas.microsoft.com/office/drawing/2016/5/12/chartex" xmlns:cx7="http://schemas.microsoft.com/office/drawing/2016/5/13/chartex" xmlns:cx8="http://schemas.microsoft.com/office/drawing/2016/5/14/chartex" xmlns:mc="http://schemas.openxmlformats.org/markup-compatibility/2006" xmlns:aink="http://schemas.microsoft.com/office/drawing/2016/ink" xmlns:am3d="http://schemas.microsoft.com/office/drawing/2017/model3d" xmlns:o="urn:schemas-microsoft-com:office:office" xmlns:oel="http://schemas.microsoft.com/office/2019/extlst" xmlns:r="http://schemas.openxmlformats.org/officeDocument/2006/relationships" xmlns:m="http://schemas.openxmlformats.org/officeDocument/2006/math" xmlns:v="urn:schemas-microsoft-com:vml" xmlns:wp14="http://schemas.microsoft.com/office/word/2010/wordprocessingDrawing" xmlns:wp="http://schemas.openxmlformats.org/drawingml/2006/wordprocessingDrawing" xmlns:w10="urn:schemas-microsoft-com:office:word" xmlns:w="http://schemas.openxmlformats.org/wordprocessingml/2006/main" xmlns:w14="http://schemas.microsoft.com/office/word/2010/wordml" xmlns:w15="http://schemas.microsoft.com/office/word/2012/wordml" xmlns:w16cex="http://schemas.microsoft.com/office/word/2018/wordml/cex" xmlns:w16cid="http://schemas.microsoft.com/office/word/2016/wordml/cid" xmlns:w16="http://schemas.microsoft.com/office/word/2018/wordml" xmlns:w16sdtdh="http://schemas.microsoft.com/office/word/2020/wordml/sdtdatahash" xmlns:w16se="http://schemas.microsoft.com/office/word/2015/wordml/symex" xmlns:wpg="http://schemas.microsoft.com/office/word/2010/wordprocessingGroup" xmlns:wpi="http://schemas.microsoft.com/office/word/2010/wordprocessingInk" xmlns:wne="http://schemas.microsoft.com/office/word/2006/wordml" xmlns:wps="http://schemas.microsoft.com/office/word/2010/wordprocessingShape" mc:Ignorable="w14 w15 w16se w16cid w16 w16cex w16sdtdh wp14">
+<w:hdr xmlns:wpc="http://schemas.microsoft.com/office/word/2010/wordprocessingCanvas" xmlns:cx="http://schemas.microsoft.com/office/drawing/2014/chartex" xmlns:cx1="http://schemas.microsoft.com/office/drawing/2015/9/8/chartex" xmlns:cx2="http://schemas.microsoft.com/office/drawing/2015/10/21/chartex" xmlns:cx3="http://schemas.microsoft.com/office/drawing/2016/5/9/chartex" xmlns:cx4="http://schemas.microsoft.com/office/drawing/2016/5/10/chartex" xmlns:cx5="http://schemas.microsoft.com/office/drawing/2016/5/11/chartex" xmlns:cx6="http://schemas.microsoft.com/office/drawing/2016/5/12/chartex" xmlns:cx7="http://schemas.microsoft.com/office/drawing/2016/5/13/chartex" xmlns:cx8="http://schemas.microsoft.com/office/drawing/2016/5/14/chartex" xmlns:mc="http://schemas.openxmlformats.org/markup-compatibility/2006" xmlns:aink="http://schemas.microsoft.com/office/drawing/2016/ink" xmlns:am3d="http://schemas.microsoft.com/office/drawing/2017/model3d" xmlns:o="urn:schemas-microsoft-com:office:office" xmlns:oel="http://schemas.microsoft.com/office/2019/extlst" xmlns:r="http://schemas.openxmlformats.org/officeDocument/2006/relationships" xmlns:m="http://schemas.openxmlformats.org/officeDocument/2006/math" xmlns:v="urn:schemas-microsoft-com:vml" xmlns:wp14="http://schemas.microsoft.com/office/word/2010/wordprocessingDrawing" xmlns:wp="http://schemas.openxmlformats.org/drawingml/2006/wordprocessingDrawing" xmlns:w10="urn:schemas-microsoft-com:office:word" xmlns:w="http://schemas.openxmlformats.org/wordprocessingml/2006/main" xmlns:w14="http://schemas.microsoft.com/office/word/2010/wordml" xmlns:w15="http://schemas.microsoft.com/office/word/2012/wordml" xmlns:w16cex="http://schemas.microsoft.com/office/word/2018/wordml/cex" xmlns:w16cid="http://schemas.microsoft.com/office/word/2016/wordml/cid" xmlns:w16="http://schemas.microsoft.com/office/word/2018/wordml" xmlns:w16du="http://schemas.microsoft.com/office/word/2023/wordml/word16du" xmlns:w16sdtdh="http://schemas.microsoft.com/office/word/2020/wordml/sdtdatahash" xmlns:w16sdtfl="http://schemas.microsoft.com/office/word/2024/wordml/sdtformatlock" xmlns:w16se="http://schemas.microsoft.com/office/word/2015/wordml/symex" xmlns:wpg="http://schemas.microsoft.com/office/word/2010/wordprocessingGroup" xmlns:wpi="http://schemas.microsoft.com/office/word/2010/wordprocessingInk" xmlns:wne="http://schemas.microsoft.com/office/word/2006/wordml" xmlns:wps="http://schemas.microsoft.com/office/word/2010/wordprocessingShape" mc:Ignorable="w14 w15 w16se w16cid w16 w16cex w16sdtdh w16sdtfl w16du wp14">
   <w:p>
     <w:pPr>
       <w:pStyle w:val="En-tte"/>
@@ -1792,7 +2300,7 @@
 </file>
 
 <file path=word/header2.xml><?xml version="1.0" encoding="utf-8"?>
-<w:hdr xmlns:wpc="http://schemas.microsoft.com/office/word/2010/wordprocessingCanvas" xmlns:cx="http://schemas.microsoft.com/office/drawing/2014/chartex" xmlns:cx1="http://schemas.microsoft.com/office/drawing/2015/9/8/chartex" xmlns:cx2="http://schemas.microsoft.com/office/drawing/2015/10/21/chartex" xmlns:cx3="http://schemas.microsoft.com/office/drawing/2016/5/9/chartex" xmlns:cx4="http://schemas.microsoft.com/office/drawing/2016/5/10/chartex" xmlns:cx5="http://schemas.microsoft.com/office/drawing/2016/5/11/chartex" xmlns:cx6="http://schemas.microsoft.com/office/drawing/2016/5/12/chartex" xmlns:cx7="http://schemas.microsoft.com/office/drawing/2016/5/13/chartex" xmlns:cx8="http://schemas.microsoft.com/office/drawing/2016/5/14/chartex" xmlns:mc="http://schemas.openxmlformats.org/markup-compatibility/2006" xmlns:aink="http://schemas.microsoft.com/office/drawing/2016/ink" xmlns:am3d="http://schemas.microsoft.com/office/drawing/2017/model3d" xmlns:o="urn:schemas-microsoft-com:office:office" xmlns:oel="http://schemas.microsoft.com/office/2019/extlst" xmlns:r="http://schemas.openxmlformats.org/officeDocument/2006/relationships" xmlns:m="http://schemas.openxmlformats.org/officeDocument/2006/math" xmlns:v="urn:schemas-microsoft-com:vml" xmlns:wp14="http://schemas.microsoft.com/office/word/2010/wordprocessingDrawing" xmlns:wp="http://schemas.openxmlformats.org/drawingml/2006/wordprocessingDrawing" xmlns:w10="urn:schemas-microsoft-com:office:word" xmlns:w="http://schemas.openxmlformats.org/wordprocessingml/2006/main" xmlns:w14="http://schemas.microsoft.com/office/word/2010/wordml" xmlns:w15="http://schemas.microsoft.com/office/word/2012/wordml" xmlns:w16cex="http://schemas.microsoft.com/office/word/2018/wordml/cex" xmlns:w16cid="http://schemas.microsoft.com/office/word/2016/wordml/cid" xmlns:w16="http://schemas.microsoft.com/office/word/2018/wordml" xmlns:w16sdtdh="http://schemas.microsoft.com/office/word/2020/wordml/sdtdatahash" xmlns:w16se="http://schemas.microsoft.com/office/word/2015/wordml/symex" xmlns:wpg="http://schemas.microsoft.com/office/word/2010/wordprocessingGroup" xmlns:wpi="http://schemas.microsoft.com/office/word/2010/wordprocessingInk" xmlns:wne="http://schemas.microsoft.com/office/word/2006/wordml" xmlns:wps="http://schemas.microsoft.com/office/word/2010/wordprocessingShape" mc:Ignorable="w14 w15 w16se w16cid w16 w16cex w16sdtdh wp14">
+<w:hdr xmlns:wpc="http://schemas.microsoft.com/office/word/2010/wordprocessingCanvas" xmlns:cx="http://schemas.microsoft.com/office/drawing/2014/chartex" xmlns:cx1="http://schemas.microsoft.com/office/drawing/2015/9/8/chartex" xmlns:cx2="http://schemas.microsoft.com/office/drawing/2015/10/21/chartex" xmlns:cx3="http://schemas.microsoft.com/office/drawing/2016/5/9/chartex" xmlns:cx4="http://schemas.microsoft.com/office/drawing/2016/5/10/chartex" xmlns:cx5="http://schemas.microsoft.com/office/drawing/2016/5/11/chartex" xmlns:cx6="http://schemas.microsoft.com/office/drawing/2016/5/12/chartex" xmlns:cx7="http://schemas.microsoft.com/office/drawing/2016/5/13/chartex" xmlns:cx8="http://schemas.microsoft.com/office/drawing/2016/5/14/chartex" xmlns:mc="http://schemas.openxmlformats.org/markup-compatibility/2006" xmlns:aink="http://schemas.microsoft.com/office/drawing/2016/ink" xmlns:am3d="http://schemas.microsoft.com/office/drawing/2017/model3d" xmlns:o="urn:schemas-microsoft-com:office:office" xmlns:oel="http://schemas.microsoft.com/office/2019/extlst" xmlns:r="http://schemas.openxmlformats.org/officeDocument/2006/relationships" xmlns:m="http://schemas.openxmlformats.org/officeDocument/2006/math" xmlns:v="urn:schemas-microsoft-com:vml" xmlns:wp14="http://schemas.microsoft.com/office/word/2010/wordprocessingDrawing" xmlns:wp="http://schemas.openxmlformats.org/drawingml/2006/wordprocessingDrawing" xmlns:w10="urn:schemas-microsoft-com:office:word" xmlns:w="http://schemas.openxmlformats.org/wordprocessingml/2006/main" xmlns:w14="http://schemas.microsoft.com/office/word/2010/wordml" xmlns:w15="http://schemas.microsoft.com/office/word/2012/wordml" xmlns:w16cex="http://schemas.microsoft.com/office/word/2018/wordml/cex" xmlns:w16cid="http://schemas.microsoft.com/office/word/2016/wordml/cid" xmlns:w16="http://schemas.microsoft.com/office/word/2018/wordml" xmlns:w16du="http://schemas.microsoft.com/office/word/2023/wordml/word16du" xmlns:w16sdtdh="http://schemas.microsoft.com/office/word/2020/wordml/sdtdatahash" xmlns:w16sdtfl="http://schemas.microsoft.com/office/word/2024/wordml/sdtformatlock" xmlns:w16se="http://schemas.microsoft.com/office/word/2015/wordml/symex" xmlns:wpg="http://schemas.microsoft.com/office/word/2010/wordprocessingGroup" xmlns:wpi="http://schemas.microsoft.com/office/word/2010/wordprocessingInk" xmlns:wne="http://schemas.microsoft.com/office/word/2006/wordml" xmlns:wps="http://schemas.microsoft.com/office/word/2010/wordprocessingShape" mc:Ignorable="w14 w15 w16se w16cid w16 w16cex w16sdtdh w16sdtfl w16du wp14">
   <w:p>
     <w:pPr>
       <w:pStyle w:val="En-tte"/>
@@ -1966,7 +2474,7 @@
 </file>
 
 <file path=word/header3.xml><?xml version="1.0" encoding="utf-8"?>
-<w:hdr xmlns:wpc="http://schemas.microsoft.com/office/word/2010/wordprocessingCanvas" xmlns:cx="http://schemas.microsoft.com/office/drawing/2014/chartex" xmlns:cx1="http://schemas.microsoft.com/office/drawing/2015/9/8/chartex" xmlns:cx2="http://schemas.microsoft.com/office/drawing/2015/10/21/chartex" xmlns:cx3="http://schemas.microsoft.com/office/drawing/2016/5/9/chartex" xmlns:cx4="http://schemas.microsoft.com/office/drawing/2016/5/10/chartex" xmlns:cx5="http://schemas.microsoft.com/office/drawing/2016/5/11/chartex" xmlns:cx6="http://schemas.microsoft.com/office/drawing/2016/5/12/chartex" xmlns:cx7="http://schemas.microsoft.com/office/drawing/2016/5/13/chartex" xmlns:cx8="http://schemas.microsoft.com/office/drawing/2016/5/14/chartex" xmlns:mc="http://schemas.openxmlformats.org/markup-compatibility/2006" xmlns:aink="http://schemas.microsoft.com/office/drawing/2016/ink" xmlns:am3d="http://schemas.microsoft.com/office/drawing/2017/model3d" xmlns:o="urn:schemas-microsoft-com:office:office" xmlns:oel="http://schemas.microsoft.com/office/2019/extlst" xmlns:r="http://schemas.openxmlformats.org/officeDocument/2006/relationships" xmlns:m="http://schemas.openxmlformats.org/officeDocument/2006/math" xmlns:v="urn:schemas-microsoft-com:vml" xmlns:wp14="http://schemas.microsoft.com/office/word/2010/wordprocessingDrawing" xmlns:wp="http://schemas.openxmlformats.org/drawingml/2006/wordprocessingDrawing" xmlns:w10="urn:schemas-microsoft-com:office:word" xmlns:w="http://schemas.openxmlformats.org/wordprocessingml/2006/main" xmlns:w14="http://schemas.microsoft.com/office/word/2010/wordml" xmlns:w15="http://schemas.microsoft.com/office/word/2012/wordml" xmlns:w16cex="http://schemas.microsoft.com/office/word/2018/wordml/cex" xmlns:w16cid="http://schemas.microsoft.com/office/word/2016/wordml/cid" xmlns:w16="http://schemas.microsoft.com/office/word/2018/wordml" xmlns:w16sdtdh="http://schemas.microsoft.com/office/word/2020/wordml/sdtdatahash" xmlns:w16se="http://schemas.microsoft.com/office/word/2015/wordml/symex" xmlns:wpg="http://schemas.microsoft.com/office/word/2010/wordprocessingGroup" xmlns:wpi="http://schemas.microsoft.com/office/word/2010/wordprocessingInk" xmlns:wne="http://schemas.microsoft.com/office/word/2006/wordml" xmlns:wps="http://schemas.microsoft.com/office/word/2010/wordprocessingShape" mc:Ignorable="w14 w15 w16se w16cid w16 w16cex w16sdtdh wp14">
+<w:hdr xmlns:wpc="http://schemas.microsoft.com/office/word/2010/wordprocessingCanvas" xmlns:cx="http://schemas.microsoft.com/office/drawing/2014/chartex" xmlns:cx1="http://schemas.microsoft.com/office/drawing/2015/9/8/chartex" xmlns:cx2="http://schemas.microsoft.com/office/drawing/2015/10/21/chartex" xmlns:cx3="http://schemas.microsoft.com/office/drawing/2016/5/9/chartex" xmlns:cx4="http://schemas.microsoft.com/office/drawing/2016/5/10/chartex" xmlns:cx5="http://schemas.microsoft.com/office/drawing/2016/5/11/chartex" xmlns:cx6="http://schemas.microsoft.com/office/drawing/2016/5/12/chartex" xmlns:cx7="http://schemas.microsoft.com/office/drawing/2016/5/13/chartex" xmlns:cx8="http://schemas.microsoft.com/office/drawing/2016/5/14/chartex" xmlns:mc="http://schemas.openxmlformats.org/markup-compatibility/2006" xmlns:aink="http://schemas.microsoft.com/office/drawing/2016/ink" xmlns:am3d="http://schemas.microsoft.com/office/drawing/2017/model3d" xmlns:o="urn:schemas-microsoft-com:office:office" xmlns:oel="http://schemas.microsoft.com/office/2019/extlst" xmlns:r="http://schemas.openxmlformats.org/officeDocument/2006/relationships" xmlns:m="http://schemas.openxmlformats.org/officeDocument/2006/math" xmlns:v="urn:schemas-microsoft-com:vml" xmlns:wp14="http://schemas.microsoft.com/office/word/2010/wordprocessingDrawing" xmlns:wp="http://schemas.openxmlformats.org/drawingml/2006/wordprocessingDrawing" xmlns:w10="urn:schemas-microsoft-com:office:word" xmlns:w="http://schemas.openxmlformats.org/wordprocessingml/2006/main" xmlns:w14="http://schemas.microsoft.com/office/word/2010/wordml" xmlns:w15="http://schemas.microsoft.com/office/word/2012/wordml" xmlns:w16cex="http://schemas.microsoft.com/office/word/2018/wordml/cex" xmlns:w16cid="http://schemas.microsoft.com/office/word/2016/wordml/cid" xmlns:w16="http://schemas.microsoft.com/office/word/2018/wordml" xmlns:w16du="http://schemas.microsoft.com/office/word/2023/wordml/word16du" xmlns:w16sdtdh="http://schemas.microsoft.com/office/word/2020/wordml/sdtdatahash" xmlns:w16sdtfl="http://schemas.microsoft.com/office/word/2024/wordml/sdtformatlock" xmlns:w16se="http://schemas.microsoft.com/office/word/2015/wordml/symex" xmlns:wpg="http://schemas.microsoft.com/office/word/2010/wordprocessingGroup" xmlns:wpi="http://schemas.microsoft.com/office/word/2010/wordprocessingInk" xmlns:wne="http://schemas.microsoft.com/office/word/2006/wordml" xmlns:wps="http://schemas.microsoft.com/office/word/2010/wordprocessingShape" mc:Ignorable="w14 w15 w16se w16cid w16 w16cex w16sdtdh w16sdtfl w16du wp14">
   <w:p>
     <w:pPr>
       <w:pStyle w:val="En-tte"/>
@@ -1976,7 +2484,7 @@
 </file>
 
 <file path=word/numbering.xml><?xml version="1.0" encoding="utf-8"?>
-<w:numbering xmlns:wpc="http://schemas.microsoft.com/office/word/2010/wordprocessingCanvas" xmlns:cx="http://schemas.microsoft.com/office/drawing/2014/chartex" xmlns:cx1="http://schemas.microsoft.com/office/drawing/2015/9/8/chartex" xmlns:cx2="http://schemas.microsoft.com/office/drawing/2015/10/21/chartex" xmlns:cx3="http://schemas.microsoft.com/office/drawing/2016/5/9/chartex" xmlns:cx4="http://schemas.microsoft.com/office/drawing/2016/5/10/chartex" xmlns:cx5="http://schemas.microsoft.com/office/drawing/2016/5/11/chartex" xmlns:cx6="http://schemas.microsoft.com/office/drawing/2016/5/12/chartex" xmlns:cx7="http://schemas.microsoft.com/office/drawing/2016/5/13/chartex" xmlns:cx8="http://schemas.microsoft.com/office/drawing/2016/5/14/chartex" xmlns:mc="http://schemas.openxmlformats.org/markup-compatibility/2006" xmlns:aink="http://schemas.microsoft.com/office/drawing/2016/ink" xmlns:am3d="http://schemas.microsoft.com/office/drawing/2017/model3d" xmlns:o="urn:schemas-microsoft-com:office:office" xmlns:oel="http://schemas.microsoft.com/office/2019/extlst" xmlns:r="http://schemas.openxmlformats.org/officeDocument/2006/relationships" xmlns:m="http://schemas.openxmlformats.org/officeDocument/2006/math" xmlns:v="urn:schemas-microsoft-com:vml" xmlns:wp14="http://schemas.microsoft.com/office/word/2010/wordprocessingDrawing" xmlns:wp="http://schemas.openxmlformats.org/drawingml/2006/wordprocessingDrawing" xmlns:w10="urn:schemas-microsoft-com:office:word" xmlns:w="http://schemas.openxmlformats.org/wordprocessingml/2006/main" xmlns:w14="http://schemas.microsoft.com/office/word/2010/wordml" xmlns:w15="http://schemas.microsoft.com/office/word/2012/wordml" xmlns:w16cex="http://schemas.microsoft.com/office/word/2018/wordml/cex" xmlns:w16cid="http://schemas.microsoft.com/office/word/2016/wordml/cid" xmlns:w16="http://schemas.microsoft.com/office/word/2018/wordml" xmlns:w16sdtdh="http://schemas.microsoft.com/office/word/2020/wordml/sdtdatahash" xmlns:w16se="http://schemas.microsoft.com/office/word/2015/wordml/symex" xmlns:wpg="http://schemas.microsoft.com/office/word/2010/wordprocessingGroup" xmlns:wpi="http://schemas.microsoft.com/office/word/2010/wordprocessingInk" xmlns:wne="http://schemas.microsoft.com/office/word/2006/wordml" xmlns:wps="http://schemas.microsoft.com/office/word/2010/wordprocessingShape" mc:Ignorable="w14 w15 w16se w16cid w16 w16cex w16sdtdh wp14">
+<w:numbering xmlns:wpc="http://schemas.microsoft.com/office/word/2010/wordprocessingCanvas" xmlns:cx="http://schemas.microsoft.com/office/drawing/2014/chartex" xmlns:cx1="http://schemas.microsoft.com/office/drawing/2015/9/8/chartex" xmlns:cx2="http://schemas.microsoft.com/office/drawing/2015/10/21/chartex" xmlns:cx3="http://schemas.microsoft.com/office/drawing/2016/5/9/chartex" xmlns:cx4="http://schemas.microsoft.com/office/drawing/2016/5/10/chartex" xmlns:cx5="http://schemas.microsoft.com/office/drawing/2016/5/11/chartex" xmlns:cx6="http://schemas.microsoft.com/office/drawing/2016/5/12/chartex" xmlns:cx7="http://schemas.microsoft.com/office/drawing/2016/5/13/chartex" xmlns:cx8="http://schemas.microsoft.com/office/drawing/2016/5/14/chartex" xmlns:mc="http://schemas.openxmlformats.org/markup-compatibility/2006" xmlns:aink="http://schemas.microsoft.com/office/drawing/2016/ink" xmlns:am3d="http://schemas.microsoft.com/office/drawing/2017/model3d" xmlns:o="urn:schemas-microsoft-com:office:office" xmlns:oel="http://schemas.microsoft.com/office/2019/extlst" xmlns:r="http://schemas.openxmlformats.org/officeDocument/2006/relationships" xmlns:m="http://schemas.openxmlformats.org/officeDocument/2006/math" xmlns:v="urn:schemas-microsoft-com:vml" xmlns:wp14="http://schemas.microsoft.com/office/word/2010/wordprocessingDrawing" xmlns:wp="http://schemas.openxmlformats.org/drawingml/2006/wordprocessingDrawing" xmlns:w10="urn:schemas-microsoft-com:office:word" xmlns:w="http://schemas.openxmlformats.org/wordprocessingml/2006/main" xmlns:w14="http://schemas.microsoft.com/office/word/2010/wordml" xmlns:w15="http://schemas.microsoft.com/office/word/2012/wordml" xmlns:w16cex="http://schemas.microsoft.com/office/word/2018/wordml/cex" xmlns:w16cid="http://schemas.microsoft.com/office/word/2016/wordml/cid" xmlns:w16="http://schemas.microsoft.com/office/word/2018/wordml" xmlns:w16du="http://schemas.microsoft.com/office/word/2023/wordml/word16du" xmlns:w16sdtdh="http://schemas.microsoft.com/office/word/2020/wordml/sdtdatahash" xmlns:w16sdtfl="http://schemas.microsoft.com/office/word/2024/wordml/sdtformatlock" xmlns:w16se="http://schemas.microsoft.com/office/word/2015/wordml/symex" xmlns:wpg="http://schemas.microsoft.com/office/word/2010/wordprocessingGroup" xmlns:wpi="http://schemas.microsoft.com/office/word/2010/wordprocessingInk" xmlns:wne="http://schemas.microsoft.com/office/word/2006/wordml" xmlns:wps="http://schemas.microsoft.com/office/word/2010/wordprocessingShape" mc:Ignorable="w14 w15 w16se w16cid w16 w16cex w16sdtdh w16sdtfl w16du wp14">
   <w:abstractNum w:abstractNumId="0" w15:restartNumberingAfterBreak="0">
     <w:nsid w:val="017A4C6F"/>
     <w:multiLevelType w:val="hybridMultilevel"/>
@@ -6325,7 +6833,7 @@
 </file>
 
 <file path=word/styles.xml><?xml version="1.0" encoding="utf-8"?>
-<w:styles xmlns:mc="http://schemas.openxmlformats.org/markup-compatibility/2006" xmlns:r="http://schemas.openxmlformats.org/officeDocument/2006/relationships" xmlns:w="http://schemas.openxmlformats.org/wordprocessingml/2006/main" xmlns:w14="http://schemas.microsoft.com/office/word/2010/wordml" xmlns:w15="http://schemas.microsoft.com/office/word/2012/wordml" xmlns:w16cex="http://schemas.microsoft.com/office/word/2018/wordml/cex" xmlns:w16cid="http://schemas.microsoft.com/office/word/2016/wordml/cid" xmlns:w16="http://schemas.microsoft.com/office/word/2018/wordml" xmlns:w16sdtdh="http://schemas.microsoft.com/office/word/2020/wordml/sdtdatahash" xmlns:w16se="http://schemas.microsoft.com/office/word/2015/wordml/symex" mc:Ignorable="w14 w15 w16se w16cid w16 w16cex w16sdtdh">
+<w:styles xmlns:mc="http://schemas.openxmlformats.org/markup-compatibility/2006" xmlns:r="http://schemas.openxmlformats.org/officeDocument/2006/relationships" xmlns:w="http://schemas.openxmlformats.org/wordprocessingml/2006/main" xmlns:w14="http://schemas.microsoft.com/office/word/2010/wordml" xmlns:w15="http://schemas.microsoft.com/office/word/2012/wordml" xmlns:w16cex="http://schemas.microsoft.com/office/word/2018/wordml/cex" xmlns:w16cid="http://schemas.microsoft.com/office/word/2016/wordml/cid" xmlns:w16="http://schemas.microsoft.com/office/word/2018/wordml" xmlns:w16du="http://schemas.microsoft.com/office/word/2023/wordml/word16du" xmlns:w16sdtdh="http://schemas.microsoft.com/office/word/2020/wordml/sdtdatahash" xmlns:w16sdtfl="http://schemas.microsoft.com/office/word/2024/wordml/sdtformatlock" xmlns:w16se="http://schemas.microsoft.com/office/word/2015/wordml/symex" mc:Ignorable="w14 w15 w16se w16cid w16 w16cex w16sdtdh w16sdtfl w16du">
   <w:docDefaults>
     <w:rPrDefault>
       <w:rPr>
@@ -6988,7 +7496,7 @@
 </file>
 
 <file path=word/glossary/document.xml><?xml version="1.0" encoding="utf-8"?>
-<w:glossaryDocument xmlns:wpc="http://schemas.microsoft.com/office/word/2010/wordprocessingCanvas" xmlns:cx="http://schemas.microsoft.com/office/drawing/2014/chartex" xmlns:cx1="http://schemas.microsoft.com/office/drawing/2015/9/8/chartex" xmlns:cx2="http://schemas.microsoft.com/office/drawing/2015/10/21/chartex" xmlns:cx3="http://schemas.microsoft.com/office/drawing/2016/5/9/chartex" xmlns:cx4="http://schemas.microsoft.com/office/drawing/2016/5/10/chartex" xmlns:cx5="http://schemas.microsoft.com/office/drawing/2016/5/11/chartex" xmlns:cx6="http://schemas.microsoft.com/office/drawing/2016/5/12/chartex" xmlns:cx7="http://schemas.microsoft.com/office/drawing/2016/5/13/chartex" xmlns:cx8="http://schemas.microsoft.com/office/drawing/2016/5/14/chartex" xmlns:mc="http://schemas.openxmlformats.org/markup-compatibility/2006" xmlns:aink="http://schemas.microsoft.com/office/drawing/2016/ink" xmlns:am3d="http://schemas.microsoft.com/office/drawing/2017/model3d" xmlns:o="urn:schemas-microsoft-com:office:office" xmlns:oel="http://schemas.microsoft.com/office/2019/extlst" xmlns:r="http://schemas.openxmlformats.org/officeDocument/2006/relationships" xmlns:m="http://schemas.openxmlformats.org/officeDocument/2006/math" xmlns:v="urn:schemas-microsoft-com:vml" xmlns:wp14="http://schemas.microsoft.com/office/word/2010/wordprocessingDrawing" xmlns:wp="http://schemas.openxmlformats.org/drawingml/2006/wordprocessingDrawing" xmlns:w10="urn:schemas-microsoft-com:office:word" xmlns:w="http://schemas.openxmlformats.org/wordprocessingml/2006/main" xmlns:w14="http://schemas.microsoft.com/office/word/2010/wordml" xmlns:w15="http://schemas.microsoft.com/office/word/2012/wordml" xmlns:w16cex="http://schemas.microsoft.com/office/word/2018/wordml/cex" xmlns:w16cid="http://schemas.microsoft.com/office/word/2016/wordml/cid" xmlns:w16="http://schemas.microsoft.com/office/word/2018/wordml" xmlns:w16sdtdh="http://schemas.microsoft.com/office/word/2020/wordml/sdtdatahash" xmlns:w16se="http://schemas.microsoft.com/office/word/2015/wordml/symex" xmlns:wpg="http://schemas.microsoft.com/office/word/2010/wordprocessingGroup" xmlns:wpi="http://schemas.microsoft.com/office/word/2010/wordprocessingInk" xmlns:wne="http://schemas.microsoft.com/office/word/2006/wordml" xmlns:wps="http://schemas.microsoft.com/office/word/2010/wordprocessingShape" mc:Ignorable="w14 w15 w16se w16cid w16 w16cex w16sdtdh wp14">
+<w:glossaryDocument xmlns:wpc="http://schemas.microsoft.com/office/word/2010/wordprocessingCanvas" xmlns:cx="http://schemas.microsoft.com/office/drawing/2014/chartex" xmlns:cx1="http://schemas.microsoft.com/office/drawing/2015/9/8/chartex" xmlns:cx2="http://schemas.microsoft.com/office/drawing/2015/10/21/chartex" xmlns:cx3="http://schemas.microsoft.com/office/drawing/2016/5/9/chartex" xmlns:cx4="http://schemas.microsoft.com/office/drawing/2016/5/10/chartex" xmlns:cx5="http://schemas.microsoft.com/office/drawing/2016/5/11/chartex" xmlns:cx6="http://schemas.microsoft.com/office/drawing/2016/5/12/chartex" xmlns:cx7="http://schemas.microsoft.com/office/drawing/2016/5/13/chartex" xmlns:cx8="http://schemas.microsoft.com/office/drawing/2016/5/14/chartex" xmlns:mc="http://schemas.openxmlformats.org/markup-compatibility/2006" xmlns:aink="http://schemas.microsoft.com/office/drawing/2016/ink" xmlns:am3d="http://schemas.microsoft.com/office/drawing/2017/model3d" xmlns:o="urn:schemas-microsoft-com:office:office" xmlns:oel="http://schemas.microsoft.com/office/2019/extlst" xmlns:r="http://schemas.openxmlformats.org/officeDocument/2006/relationships" xmlns:m="http://schemas.openxmlformats.org/officeDocument/2006/math" xmlns:v="urn:schemas-microsoft-com:vml" xmlns:wp14="http://schemas.microsoft.com/office/word/2010/wordprocessingDrawing" xmlns:wp="http://schemas.openxmlformats.org/drawingml/2006/wordprocessingDrawing" xmlns:w10="urn:schemas-microsoft-com:office:word" xmlns:w="http://schemas.openxmlformats.org/wordprocessingml/2006/main" xmlns:w14="http://schemas.microsoft.com/office/word/2010/wordml" xmlns:w15="http://schemas.microsoft.com/office/word/2012/wordml" xmlns:w16cex="http://schemas.microsoft.com/office/word/2018/wordml/cex" xmlns:w16cid="http://schemas.microsoft.com/office/word/2016/wordml/cid" xmlns:w16="http://schemas.microsoft.com/office/word/2018/wordml" xmlns:w16du="http://schemas.microsoft.com/office/word/2023/wordml/word16du" xmlns:w16sdtdh="http://schemas.microsoft.com/office/word/2020/wordml/sdtdatahash" xmlns:w16sdtfl="http://schemas.microsoft.com/office/word/2024/wordml/sdtformatlock" xmlns:w16se="http://schemas.microsoft.com/office/word/2015/wordml/symex" xmlns:wpg="http://schemas.microsoft.com/office/word/2010/wordprocessingGroup" xmlns:wpi="http://schemas.microsoft.com/office/word/2010/wordprocessingInk" xmlns:wne="http://schemas.microsoft.com/office/word/2006/wordml" xmlns:wps="http://schemas.microsoft.com/office/word/2010/wordprocessingShape" mc:Ignorable="w14 w15 w16se w16cid w16 w16cex w16sdtdh w16sdtfl w16du wp14">
   <w:docParts>
     <w:docPart>
       <w:docPartPr>
@@ -7021,7 +7529,7 @@
 </file>
 
 <file path=word/glossary/fontTable.xml><?xml version="1.0" encoding="utf-8"?>
-<w:fonts xmlns:mc="http://schemas.openxmlformats.org/markup-compatibility/2006" xmlns:r="http://schemas.openxmlformats.org/officeDocument/2006/relationships" xmlns:w="http://schemas.openxmlformats.org/wordprocessingml/2006/main" xmlns:w14="http://schemas.microsoft.com/office/word/2010/wordml" xmlns:w15="http://schemas.microsoft.com/office/word/2012/wordml" xmlns:w16cex="http://schemas.microsoft.com/office/word/2018/wordml/cex" xmlns:w16cid="http://schemas.microsoft.com/office/word/2016/wordml/cid" xmlns:w16="http://schemas.microsoft.com/office/word/2018/wordml" xmlns:w16sdtdh="http://schemas.microsoft.com/office/word/2020/wordml/sdtdatahash" xmlns:w16se="http://schemas.microsoft.com/office/word/2015/wordml/symex" mc:Ignorable="w14 w15 w16se w16cid w16 w16cex w16sdtdh">
+<w:fonts xmlns:mc="http://schemas.openxmlformats.org/markup-compatibility/2006" xmlns:r="http://schemas.openxmlformats.org/officeDocument/2006/relationships" xmlns:w="http://schemas.openxmlformats.org/wordprocessingml/2006/main" xmlns:w14="http://schemas.microsoft.com/office/word/2010/wordml" xmlns:w15="http://schemas.microsoft.com/office/word/2012/wordml" xmlns:w16cex="http://schemas.microsoft.com/office/word/2018/wordml/cex" xmlns:w16cid="http://schemas.microsoft.com/office/word/2016/wordml/cid" xmlns:w16="http://schemas.microsoft.com/office/word/2018/wordml" xmlns:w16du="http://schemas.microsoft.com/office/word/2023/wordml/word16du" xmlns:w16sdtdh="http://schemas.microsoft.com/office/word/2020/wordml/sdtdatahash" xmlns:w16sdtfl="http://schemas.microsoft.com/office/word/2024/wordml/sdtformatlock" xmlns:w16se="http://schemas.microsoft.com/office/word/2015/wordml/symex" mc:Ignorable="w14 w15 w16se w16cid w16 w16cex w16sdtdh w16sdtfl w16du">
   <w:font w:name="Times New Roman">
     <w:panose1 w:val="02020603050405020304"/>
     <w:charset w:val="00"/>
@@ -7055,7 +7563,7 @@
     <w:charset w:val="00"/>
     <w:family w:val="swiss"/>
     <w:pitch w:val="variable"/>
-    <w:sig w:usb0="E4002EFF" w:usb1="C000247B" w:usb2="00000009" w:usb3="00000000" w:csb0="000001FF" w:csb1="00000000"/>
+    <w:sig w:usb0="E4002EFF" w:usb1="C200247B" w:usb2="00000009" w:usb3="00000000" w:csb0="000001FF" w:csb1="00000000"/>
   </w:font>
   <w:font w:name="Bell MT">
     <w:panose1 w:val="02020503060305020303"/>
@@ -7072,7 +7580,6 @@
     <w:sig w:usb0="00000007" w:usb1="00000000" w:usb2="00000000" w:usb3="00000000" w:csb0="00000003" w:csb1="00000000"/>
   </w:font>
   <w:font w:name="Gulim">
-    <w:altName w:val="굴림"/>
     <w:panose1 w:val="020B0600000101010101"/>
     <w:charset w:val="81"/>
     <w:family w:val="swiss"/>
@@ -7091,13 +7598,25 @@
     <w:charset w:val="00"/>
     <w:family w:val="swiss"/>
     <w:pitch w:val="variable"/>
-    <w:sig w:usb0="E4002EFF" w:usb1="C000247B" w:usb2="00000009" w:usb3="00000000" w:csb0="000001FF" w:csb1="00000000"/>
+    <w:sig w:usb0="E4002EFF" w:usb1="C200247B" w:usb2="00000009" w:usb3="00000000" w:csb0="000001FF" w:csb1="00000000"/>
+  </w:font>
+  <w:font w:name="Aptos">
+    <w:charset w:val="00"/>
+    <w:family w:val="swiss"/>
+    <w:pitch w:val="variable"/>
+    <w:sig w:usb0="20000287" w:usb1="00000003" w:usb2="00000000" w:usb3="00000000" w:csb0="0000019F" w:csb1="00000000"/>
+  </w:font>
+  <w:font w:name="Aptos Display">
+    <w:charset w:val="00"/>
+    <w:family w:val="swiss"/>
+    <w:pitch w:val="variable"/>
+    <w:sig w:usb0="20000287" w:usb1="00000003" w:usb2="00000000" w:usb3="00000000" w:csb0="0000019F" w:csb1="00000000"/>
   </w:font>
 </w:fonts>
 </file>
 
 <file path=word/glossary/settings.xml><?xml version="1.0" encoding="utf-8"?>
-<w:settings xmlns:mc="http://schemas.openxmlformats.org/markup-compatibility/2006" xmlns:o="urn:schemas-microsoft-com:office:office" xmlns:r="http://schemas.openxmlformats.org/officeDocument/2006/relationships" xmlns:m="http://schemas.openxmlformats.org/officeDocument/2006/math" xmlns:v="urn:schemas-microsoft-com:vml" xmlns:w10="urn:schemas-microsoft-com:office:word" xmlns:w="http://schemas.openxmlformats.org/wordprocessingml/2006/main" xmlns:w14="http://schemas.microsoft.com/office/word/2010/wordml" xmlns:w15="http://schemas.microsoft.com/office/word/2012/wordml" xmlns:w16cex="http://schemas.microsoft.com/office/word/2018/wordml/cex" xmlns:w16cid="http://schemas.microsoft.com/office/word/2016/wordml/cid" xmlns:w16="http://schemas.microsoft.com/office/word/2018/wordml" xmlns:w16sdtdh="http://schemas.microsoft.com/office/word/2020/wordml/sdtdatahash" xmlns:w16se="http://schemas.microsoft.com/office/word/2015/wordml/symex" xmlns:sl="http://schemas.openxmlformats.org/schemaLibrary/2006/main" mc:Ignorable="w14 w15 w16se w16cid w16 w16cex w16sdtdh">
+<w:settings xmlns:mc="http://schemas.openxmlformats.org/markup-compatibility/2006" xmlns:o="urn:schemas-microsoft-com:office:office" xmlns:r="http://schemas.openxmlformats.org/officeDocument/2006/relationships" xmlns:m="http://schemas.openxmlformats.org/officeDocument/2006/math" xmlns:v="urn:schemas-microsoft-com:vml" xmlns:w10="urn:schemas-microsoft-com:office:word" xmlns:w="http://schemas.openxmlformats.org/wordprocessingml/2006/main" xmlns:w14="http://schemas.microsoft.com/office/word/2010/wordml" xmlns:w15="http://schemas.microsoft.com/office/word/2012/wordml" xmlns:w16cex="http://schemas.microsoft.com/office/word/2018/wordml/cex" xmlns:w16cid="http://schemas.microsoft.com/office/word/2016/wordml/cid" xmlns:w16="http://schemas.microsoft.com/office/word/2018/wordml" xmlns:w16du="http://schemas.microsoft.com/office/word/2023/wordml/word16du" xmlns:w16sdtdh="http://schemas.microsoft.com/office/word/2020/wordml/sdtdatahash" xmlns:w16sdtfl="http://schemas.microsoft.com/office/word/2024/wordml/sdtformatlock" xmlns:w16se="http://schemas.microsoft.com/office/word/2015/wordml/symex" xmlns:sl="http://schemas.openxmlformats.org/schemaLibrary/2006/main" mc:Ignorable="w14 w15 w16se w16cid w16 w16cex w16sdtdh w16sdtfl w16du">
   <w:view w:val="normal"/>
   <w:defaultTabStop w:val="708"/>
   <w:hyphenationZone w:val="425"/>
@@ -7117,8 +7636,10 @@
     <w:rsid w:val="002D50EB"/>
     <w:rsid w:val="004044BA"/>
     <w:rsid w:val="00481E69"/>
+    <w:rsid w:val="00666C19"/>
     <w:rsid w:val="00672E20"/>
     <w:rsid w:val="00912843"/>
+    <w:rsid w:val="00A31FC6"/>
     <w:rsid w:val="00A862A9"/>
     <w:rsid w:val="00C3120A"/>
     <w:rsid w:val="00C830EE"/>
@@ -7146,7 +7667,7 @@
 </file>
 
 <file path=word/glossary/styles.xml><?xml version="1.0" encoding="utf-8"?>
-<w:styles xmlns:mc="http://schemas.openxmlformats.org/markup-compatibility/2006" xmlns:r="http://schemas.openxmlformats.org/officeDocument/2006/relationships" xmlns:w="http://schemas.openxmlformats.org/wordprocessingml/2006/main" xmlns:w14="http://schemas.microsoft.com/office/word/2010/wordml" xmlns:w15="http://schemas.microsoft.com/office/word/2012/wordml" xmlns:w16cex="http://schemas.microsoft.com/office/word/2018/wordml/cex" xmlns:w16cid="http://schemas.microsoft.com/office/word/2016/wordml/cid" xmlns:w16="http://schemas.microsoft.com/office/word/2018/wordml" xmlns:w16sdtdh="http://schemas.microsoft.com/office/word/2020/wordml/sdtdatahash" xmlns:w16se="http://schemas.microsoft.com/office/word/2015/wordml/symex" mc:Ignorable="w14 w15 w16se w16cid w16 w16cex w16sdtdh">
+<w:styles xmlns:mc="http://schemas.openxmlformats.org/markup-compatibility/2006" xmlns:r="http://schemas.openxmlformats.org/officeDocument/2006/relationships" xmlns:w="http://schemas.openxmlformats.org/wordprocessingml/2006/main" xmlns:w14="http://schemas.microsoft.com/office/word/2010/wordml" xmlns:w15="http://schemas.microsoft.com/office/word/2012/wordml" xmlns:w16cex="http://schemas.microsoft.com/office/word/2018/wordml/cex" xmlns:w16cid="http://schemas.microsoft.com/office/word/2016/wordml/cid" xmlns:w16="http://schemas.microsoft.com/office/word/2018/wordml" xmlns:w16du="http://schemas.microsoft.com/office/word/2023/wordml/word16du" xmlns:w16sdtdh="http://schemas.microsoft.com/office/word/2020/wordml/sdtdatahash" xmlns:w16sdtfl="http://schemas.microsoft.com/office/word/2024/wordml/sdtformatlock" xmlns:w16se="http://schemas.microsoft.com/office/word/2015/wordml/symex" mc:Ignorable="w14 w15 w16se w16cid w16 w16cex w16sdtdh w16sdtfl w16du">
   <w:docDefaults>
     <w:rPrDefault>
       <w:rPr>
@@ -7585,7 +8106,7 @@
 </file>
 
 <file path=word/glossary/webSettings.xml><?xml version="1.0" encoding="utf-8"?>
-<w:webSettings xmlns:mc="http://schemas.openxmlformats.org/markup-compatibility/2006" xmlns:r="http://schemas.openxmlformats.org/officeDocument/2006/relationships" xmlns:w="http://schemas.openxmlformats.org/wordprocessingml/2006/main" xmlns:w14="http://schemas.microsoft.com/office/word/2010/wordml" xmlns:w15="http://schemas.microsoft.com/office/word/2012/wordml" xmlns:w16cex="http://schemas.microsoft.com/office/word/2018/wordml/cex" xmlns:w16cid="http://schemas.microsoft.com/office/word/2016/wordml/cid" xmlns:w16="http://schemas.microsoft.com/office/word/2018/wordml" xmlns:w16sdtdh="http://schemas.microsoft.com/office/word/2020/wordml/sdtdatahash" xmlns:w16se="http://schemas.microsoft.com/office/word/2015/wordml/symex" mc:Ignorable="w14 w15 w16se w16cid w16 w16cex w16sdtdh">
+<w:webSettings xmlns:mc="http://schemas.openxmlformats.org/markup-compatibility/2006" xmlns:r="http://schemas.openxmlformats.org/officeDocument/2006/relationships" xmlns:w="http://schemas.openxmlformats.org/wordprocessingml/2006/main" xmlns:w14="http://schemas.microsoft.com/office/word/2010/wordml" xmlns:w15="http://schemas.microsoft.com/office/word/2012/wordml" xmlns:w16cex="http://schemas.microsoft.com/office/word/2018/wordml/cex" xmlns:w16cid="http://schemas.microsoft.com/office/word/2016/wordml/cid" xmlns:w16="http://schemas.microsoft.com/office/word/2018/wordml" xmlns:w16du="http://schemas.microsoft.com/office/word/2023/wordml/word16du" xmlns:w16sdtdh="http://schemas.microsoft.com/office/word/2020/wordml/sdtdatahash" xmlns:w16sdtfl="http://schemas.microsoft.com/office/word/2024/wordml/sdtformatlock" xmlns:w16se="http://schemas.microsoft.com/office/word/2015/wordml/symex" mc:Ignorable="w14 w15 w16se w16cid w16 w16cex w16sdtdh w16sdtfl w16du">
   <w:optimizeForBrowser/>
   <w:allowPNG/>
 </w:webSettings>

</xml_diff>